<commit_message>
chore: commit all current project changes
</commit_message>
<xml_diff>
--- a/const strengthOptions.docx
+++ b/const strengthOptions.docx
@@ -5,6 +5,318 @@
     <w:p>
       <w:pPr>
         <w:rPr>
+          <w:rFonts w:hint="default"/>
+          <w:lang w:val="en-US" w:eastAsia="zh-CN"/>
+        </w:rPr>
+      </w:pPr>
+      <w:r>
+        <w:rPr>
+          <w:rFonts w:hint="eastAsia"/>
+          <w:lang w:val="en-US" w:eastAsia="zh-CN"/>
+        </w:rPr>
+        <w:t>对齐筛选结果字段：比赛ID:如：26024_100；</w:t>
+      </w:r>
+      <w:r>
+        <w:rPr>
+          <w:rFonts w:ascii="宋体" w:hAnsi="宋体" w:eastAsia="宋体" w:cs="宋体"/>
+          <w:kern w:val="0"/>
+          <w:sz w:val="24"/>
+          <w:szCs w:val="24"/>
+          <w:lang w:val="en-US" w:eastAsia="zh-CN" w:bidi="ar"/>
+        </w:rPr>
+        <w:t>ΔP</w:t>
+      </w:r>
+      <w:r>
+        <w:rPr>
+          <w:rFonts w:hint="eastAsia" w:ascii="宋体" w:hAnsi="宋体" w:eastAsia="宋体" w:cs="宋体"/>
+          <w:kern w:val="0"/>
+          <w:sz w:val="24"/>
+          <w:szCs w:val="24"/>
+          <w:lang w:val="en-US" w:eastAsia="zh-CN" w:bidi="ar"/>
+        </w:rPr>
+        <w:t>：如：+3，</w:t>
+      </w:r>
+      <w:r>
+        <w:rPr>
+          <w:rFonts w:ascii="宋体" w:hAnsi="宋体" w:eastAsia="宋体" w:cs="宋体"/>
+          <w:kern w:val="0"/>
+          <w:sz w:val="24"/>
+          <w:szCs w:val="24"/>
+          <w:lang w:val="en-US" w:eastAsia="zh-CN" w:bidi="ar"/>
+        </w:rPr>
+        <w:t>ΔWP</w:t>
+      </w:r>
+      <w:r>
+        <w:rPr>
+          <w:rFonts w:hint="eastAsia"/>
+          <w:lang w:val="en-US" w:eastAsia="zh-CN"/>
+        </w:rPr>
+        <w:t>如：+4；P级 如：P1 ；</w:t>
+      </w:r>
+    </w:p>
+    <w:p>
+      <w:pPr>
+        <w:rPr>
+          <w:rFonts w:hint="eastAsia"/>
+          <w:lang w:val="en-US" w:eastAsia="zh-CN"/>
+        </w:rPr>
+      </w:pPr>
+    </w:p>
+    <w:p>
+      <w:pPr>
+        <w:rPr>
+          <w:rFonts w:hint="eastAsia"/>
+          <w:lang w:val="en-US" w:eastAsia="zh-CN"/>
+        </w:rPr>
+      </w:pPr>
+    </w:p>
+    <w:p>
+      <w:pPr>
+        <w:rPr>
+          <w:rFonts w:hint="eastAsia"/>
+          <w:lang w:val="en-US" w:eastAsia="zh-CN"/>
+        </w:rPr>
+      </w:pPr>
+      <w:r>
+        <w:rPr>
+          <w:rFonts w:hint="eastAsia"/>
+          <w:lang w:val="en-US" w:eastAsia="zh-CN"/>
+        </w:rPr>
+        <w:t>说明：从</w:t>
+      </w:r>
+      <w:r>
+        <w:rPr>
+          <w:rFonts w:hint="eastAsia"/>
+        </w:rPr>
+        <w:t>100球数据源获取的数据，保存数据库Football</w:t>
+      </w:r>
+      <w:r>
+        <w:rPr>
+          <w:rFonts w:hint="eastAsia"/>
+          <w:lang w:val="en-US" w:eastAsia="zh-CN"/>
+        </w:rPr>
+        <w:t>-</w:t>
+      </w:r>
+      <w:r>
+        <w:rPr>
+          <w:rFonts w:hint="eastAsia"/>
+        </w:rPr>
+        <w:t>Match</w:t>
+      </w:r>
+      <w:r>
+        <w:rPr>
+          <w:rFonts w:hint="eastAsia"/>
+          <w:lang w:val="en-US" w:eastAsia="zh-CN"/>
+        </w:rPr>
+        <w:t>s中,</w:t>
+      </w:r>
+      <w:r>
+        <w:rPr>
+          <w:rFonts w:hint="eastAsia"/>
+        </w:rPr>
+        <w:t>date_time 字段</w:t>
+      </w:r>
+      <w:r>
+        <w:rPr>
+          <w:rFonts w:hint="eastAsia"/>
+          <w:lang w:eastAsia="zh-CN"/>
+        </w:rPr>
+        <w:t>，</w:t>
+      </w:r>
+      <w:r>
+        <w:rPr>
+          <w:rFonts w:hint="eastAsia"/>
+          <w:lang w:val="en-US" w:eastAsia="zh-CN"/>
+        </w:rPr>
+        <w:t>如：26024；lineid:如100；</w:t>
+      </w:r>
+      <w:r>
+        <w:rPr>
+          <w:rFonts w:hint="eastAsia"/>
+        </w:rPr>
+        <w:t>比赛ID</w:t>
+      </w:r>
+      <w:r>
+        <w:rPr>
+          <w:rFonts w:hint="eastAsia"/>
+          <w:lang w:val="en-US" w:eastAsia="zh-CN"/>
+        </w:rPr>
+        <w:t>字段，</w:t>
+      </w:r>
+      <w:r>
+        <w:rPr>
+          <w:rFonts w:hint="eastAsia"/>
+        </w:rPr>
+        <w:t>date_time_lineId 格式</w:t>
+      </w:r>
+      <w:r>
+        <w:rPr>
+          <w:rFonts w:hint="eastAsia"/>
+          <w:lang w:eastAsia="zh-CN"/>
+        </w:rPr>
+        <w:t>，</w:t>
+      </w:r>
+      <w:r>
+        <w:rPr>
+          <w:rFonts w:hint="eastAsia"/>
+          <w:lang w:val="en-US" w:eastAsia="zh-CN"/>
+        </w:rPr>
+        <w:t>如：26024_100;</w:t>
+      </w:r>
+    </w:p>
+    <w:p>
+      <w:pPr>
+        <w:rPr>
+          <w:rFonts w:hint="eastAsia"/>
+          <w:lang w:val="en-US" w:eastAsia="zh-CN"/>
+        </w:rPr>
+      </w:pPr>
+    </w:p>
+    <w:p>
+      <w:pPr>
+        <w:rPr>
+          <w:rFonts w:hint="default"/>
+          <w:lang w:val="en-US" w:eastAsia="zh-CN"/>
+        </w:rPr>
+      </w:pPr>
+      <w:r>
+        <w:rPr>
+          <w:rFonts w:hint="eastAsia"/>
+          <w:lang w:val="en-US" w:eastAsia="zh-CN"/>
+        </w:rPr>
+        <w:t>目前操作字段中，点击分析弹窗不出来，看不到分析页面；</w:t>
+      </w:r>
+    </w:p>
+    <w:p>
+      <w:pPr>
+        <w:rPr>
+          <w:rFonts w:hint="eastAsia"/>
+          <w:lang w:val="en-US" w:eastAsia="zh-CN"/>
+        </w:rPr>
+      </w:pPr>
+      <w:bookmarkStart w:id="0" w:name="_GoBack"/>
+      <w:bookmarkEnd w:id="0"/>
+    </w:p>
+    <w:p>
+      <w:pPr>
+        <w:rPr>
+          <w:rFonts w:hint="eastAsia"/>
+          <w:lang w:val="en-US" w:eastAsia="zh-CN"/>
+        </w:rPr>
+      </w:pPr>
+    </w:p>
+    <w:p>
+      <w:pPr>
+        <w:rPr>
+          <w:rFonts w:hint="eastAsia"/>
+          <w:lang w:val="en-US" w:eastAsia="zh-CN"/>
+        </w:rPr>
+      </w:pPr>
+    </w:p>
+    <w:p>
+      <w:pPr>
+        <w:rPr>
+          <w:rFonts w:hint="default"/>
+          <w:lang w:val="en-US" w:eastAsia="zh-CN"/>
+        </w:rPr>
+      </w:pPr>
+    </w:p>
+    <w:p>
+      <w:pPr>
+        <w:rPr>
+          <w:rFonts w:hint="default"/>
+          <w:lang w:val="en-US" w:eastAsia="zh-CN"/>
+        </w:rPr>
+      </w:pPr>
+    </w:p>
+    <w:p>
+      <w:pPr>
+        <w:rPr>
+          <w:rFonts w:hint="eastAsia"/>
+          <w:lang w:val="en-US" w:eastAsia="zh-CN"/>
+        </w:rPr>
+      </w:pPr>
+    </w:p>
+    <w:p>
+      <w:pPr>
+        <w:rPr>
+          <w:rFonts w:hint="default"/>
+          <w:lang w:val="en-US" w:eastAsia="zh-CN"/>
+        </w:rPr>
+      </w:pPr>
+      <w:r>
+        <w:rPr>
+          <w:rFonts w:hint="eastAsia"/>
+          <w:lang w:val="en-US" w:eastAsia="zh-CN"/>
+        </w:rPr>
+        <w:t>保存策略按钮点击后，提示保存失败。</w:t>
+      </w:r>
+    </w:p>
+    <w:p>
+      <w:pPr>
+        <w:rPr>
+          <w:rFonts w:hint="eastAsia"/>
+          <w:lang w:val="en-US" w:eastAsia="zh-CN"/>
+        </w:rPr>
+      </w:pPr>
+    </w:p>
+    <w:p>
+      <w:pPr>
+        <w:rPr>
+          <w:rFonts w:hint="eastAsia"/>
+          <w:lang w:val="en-US" w:eastAsia="zh-CN"/>
+        </w:rPr>
+      </w:pPr>
+    </w:p>
+    <w:p>
+      <w:pPr>
+        <w:rPr>
+          <w:rFonts w:hint="eastAsia"/>
+          <w:lang w:val="en-US" w:eastAsia="zh-CN"/>
+        </w:rPr>
+      </w:pPr>
+    </w:p>
+    <w:p>
+      <w:pPr>
+        <w:rPr>
+          <w:rFonts w:hint="default" w:eastAsiaTheme="minorEastAsia"/>
+          <w:lang w:val="en-US" w:eastAsia="zh-CN"/>
+        </w:rPr>
+      </w:pPr>
+      <w:r>
+        <w:rPr>
+          <w:rFonts w:hint="eastAsia"/>
+          <w:lang w:val="en-US" w:eastAsia="zh-CN"/>
+        </w:rPr>
+        <w:t>这是重要的参数规则，</w:t>
+      </w:r>
+    </w:p>
+    <w:p>
+      <w:pPr>
+        <w:rPr>
+          <w:rFonts w:hint="eastAsia"/>
+        </w:rPr>
+      </w:pPr>
+      <w:r>
+        <w:rPr>
+          <w:rFonts w:ascii="Helvetica" w:hAnsi="Helvetica" w:eastAsia="Helvetica" w:cs="Helvetica"/>
+          <w:b/>
+          <w:bCs/>
+          <w:i w:val="0"/>
+          <w:iCs w:val="0"/>
+          <w:caps w:val="0"/>
+          <w:color w:val="6B6763"/>
+          <w:spacing w:val="0"/>
+          <w:sz w:val="16"/>
+          <w:szCs w:val="16"/>
+          <w:shd w:val="clear" w:fill="FDFCFB"/>
+        </w:rPr>
+        <w:t>实力等级差 ΔP</w:t>
+      </w:r>
+    </w:p>
+    <w:p>
+      <w:pPr>
+        <w:rPr>
           <w:rFonts w:hint="eastAsia"/>
         </w:rPr>
       </w:pPr>
@@ -104,6 +416,525 @@
           <w:rFonts w:hint="eastAsia"/>
         </w:rPr>
         <w:t xml:space="preserve">  { value: 3, label: '+3', range: '&gt; +25', desc: '主队实力碾压' }</w:t>
+      </w:r>
+    </w:p>
+    <w:p>
+      <w:pPr>
+        <w:rPr>
+          <w:rFonts w:hint="eastAsia"/>
+        </w:rPr>
+      </w:pPr>
+      <w:r>
+        <w:rPr>
+          <w:rFonts w:hint="eastAsia"/>
+        </w:rPr>
+        <w:t>];</w:t>
+      </w:r>
+    </w:p>
+    <w:p/>
+    <w:p>
+      <w:pPr>
+        <w:rPr>
+          <w:rFonts w:hint="eastAsia" w:eastAsia="宋体"/>
+          <w:lang w:eastAsia="zh-CN"/>
+        </w:rPr>
+      </w:pPr>
+      <w:r>
+        <w:rPr>
+          <w:rFonts w:ascii="Helvetica" w:hAnsi="Helvetica" w:eastAsia="Helvetica" w:cs="Helvetica"/>
+          <w:b/>
+          <w:bCs/>
+          <w:i w:val="0"/>
+          <w:iCs w:val="0"/>
+          <w:caps w:val="0"/>
+          <w:color w:val="6B6763"/>
+          <w:spacing w:val="0"/>
+          <w:sz w:val="16"/>
+          <w:szCs w:val="16"/>
+          <w:shd w:val="clear" w:fill="FDFCFB"/>
+        </w:rPr>
+        <w:t>赢盘等级差 ΔWP</w:t>
+      </w:r>
+      <w:r>
+        <w:rPr>
+          <w:rFonts w:hint="eastAsia" w:ascii="Helvetica" w:hAnsi="Helvetica" w:eastAsia="宋体" w:cs="Helvetica"/>
+          <w:b/>
+          <w:bCs/>
+          <w:i w:val="0"/>
+          <w:iCs w:val="0"/>
+          <w:caps w:val="0"/>
+          <w:color w:val="6B6763"/>
+          <w:spacing w:val="0"/>
+          <w:sz w:val="16"/>
+          <w:szCs w:val="16"/>
+          <w:shd w:val="clear" w:fill="FDFCFB"/>
+          <w:lang w:eastAsia="zh-CN"/>
+        </w:rPr>
+        <w:t>；</w:t>
+      </w:r>
+    </w:p>
+    <w:p>
+      <w:pPr>
+        <w:rPr>
+          <w:rFonts w:hint="eastAsia"/>
+        </w:rPr>
+      </w:pPr>
+      <w:r>
+        <w:rPr>
+          <w:rFonts w:hint="eastAsia"/>
+        </w:rPr>
+        <w:t>const winPanOptions = [</w:t>
+      </w:r>
+    </w:p>
+    <w:p>
+      <w:pPr>
+        <w:rPr>
+          <w:rFonts w:hint="eastAsia"/>
+        </w:rPr>
+      </w:pPr>
+      <w:r>
+        <w:rPr>
+          <w:rFonts w:hint="eastAsia"/>
+        </w:rPr>
+        <w:t xml:space="preserve">  { value: 4, label: '+4', range: 'S', desc: '主极致</w:t>
+      </w:r>
+      <w:r>
+        <w:rPr>
+          <w:rFonts w:hint="eastAsia"/>
+          <w:lang w:val="en-US" w:eastAsia="zh-CN"/>
+        </w:rPr>
+        <w:t>火热</w:t>
+      </w:r>
+      <w:r>
+        <w:rPr>
+          <w:rFonts w:hint="eastAsia"/>
+        </w:rPr>
+        <w:t>' },</w:t>
+      </w:r>
+    </w:p>
+    <w:p>
+      <w:pPr>
+        <w:rPr>
+          <w:rFonts w:hint="eastAsia"/>
+        </w:rPr>
+      </w:pPr>
+      <w:r>
+        <w:rPr>
+          <w:rFonts w:hint="eastAsia"/>
+        </w:rPr>
+        <w:t xml:space="preserve">  { value: 3, label: '+3', range: 'S', desc: '主极致</w:t>
+      </w:r>
+      <w:r>
+        <w:rPr>
+          <w:rFonts w:hint="eastAsia"/>
+          <w:lang w:val="en-US" w:eastAsia="zh-CN"/>
+        </w:rPr>
+        <w:t>火热</w:t>
+      </w:r>
+      <w:r>
+        <w:rPr>
+          <w:rFonts w:hint="eastAsia"/>
+        </w:rPr>
+        <w:t>' },</w:t>
+      </w:r>
+    </w:p>
+    <w:p>
+      <w:pPr>
+        <w:rPr>
+          <w:rFonts w:hint="eastAsia"/>
+        </w:rPr>
+      </w:pPr>
+      <w:r>
+        <w:rPr>
+          <w:rFonts w:hint="eastAsia"/>
+        </w:rPr>
+        <w:t xml:space="preserve">  { value: 2, label: '+2', range: 'A', desc: '主获利</w:t>
+      </w:r>
+      <w:r>
+        <w:rPr>
+          <w:rFonts w:hint="eastAsia"/>
+          <w:lang w:val="en-US" w:eastAsia="zh-CN"/>
+        </w:rPr>
+        <w:t>走强</w:t>
+      </w:r>
+      <w:r>
+        <w:rPr>
+          <w:rFonts w:hint="eastAsia"/>
+        </w:rPr>
+        <w:t>' },</w:t>
+      </w:r>
+    </w:p>
+    <w:p>
+      <w:pPr>
+        <w:rPr>
+          <w:rFonts w:hint="eastAsia"/>
+        </w:rPr>
+      </w:pPr>
+      <w:r>
+        <w:rPr>
+          <w:rFonts w:hint="eastAsia"/>
+        </w:rPr>
+        <w:t xml:space="preserve">  { value: 1, label: '+1', range: 'A', desc: '主获利</w:t>
+      </w:r>
+      <w:r>
+        <w:rPr>
+          <w:rFonts w:hint="eastAsia"/>
+          <w:lang w:val="en-US" w:eastAsia="zh-CN"/>
+        </w:rPr>
+        <w:t>走强</w:t>
+      </w:r>
+      <w:r>
+        <w:rPr>
+          <w:rFonts w:hint="eastAsia"/>
+        </w:rPr>
+        <w:t>' },</w:t>
+      </w:r>
+    </w:p>
+    <w:p>
+      <w:pPr>
+        <w:rPr>
+          <w:rFonts w:hint="eastAsia"/>
+        </w:rPr>
+      </w:pPr>
+      <w:r>
+        <w:rPr>
+          <w:rFonts w:hint="eastAsia"/>
+        </w:rPr>
+        <w:t xml:space="preserve">  { value: 0, label: '0', range: 'B', desc: '</w:t>
+      </w:r>
+      <w:r>
+        <w:rPr>
+          <w:rFonts w:hint="eastAsia"/>
+          <w:lang w:val="en-US" w:eastAsia="zh-CN"/>
+        </w:rPr>
+        <w:t>数据均衡</w:t>
+      </w:r>
+      <w:r>
+        <w:rPr>
+          <w:rFonts w:hint="eastAsia"/>
+        </w:rPr>
+        <w:t>' },</w:t>
+      </w:r>
+    </w:p>
+    <w:p>
+      <w:pPr>
+        <w:rPr>
+          <w:rFonts w:hint="eastAsia"/>
+        </w:rPr>
+      </w:pPr>
+      <w:r>
+        <w:rPr>
+          <w:rFonts w:hint="eastAsia"/>
+        </w:rPr>
+        <w:t xml:space="preserve">  { value: -1, label: '-1', range: 'C', desc: '客获利</w:t>
+      </w:r>
+      <w:r>
+        <w:rPr>
+          <w:rFonts w:hint="eastAsia"/>
+          <w:lang w:val="en-US" w:eastAsia="zh-CN"/>
+        </w:rPr>
+        <w:t>走强</w:t>
+      </w:r>
+      <w:r>
+        <w:rPr>
+          <w:rFonts w:hint="eastAsia"/>
+        </w:rPr>
+        <w:t>' },</w:t>
+      </w:r>
+    </w:p>
+    <w:p>
+      <w:pPr>
+        <w:rPr>
+          <w:rFonts w:hint="eastAsia"/>
+        </w:rPr>
+      </w:pPr>
+      <w:r>
+        <w:rPr>
+          <w:rFonts w:hint="eastAsia"/>
+        </w:rPr>
+        <w:t xml:space="preserve">  { value: -2, label: '-2', range: 'C', desc: '客获利</w:t>
+      </w:r>
+      <w:r>
+        <w:rPr>
+          <w:rFonts w:hint="eastAsia"/>
+          <w:lang w:val="en-US" w:eastAsia="zh-CN"/>
+        </w:rPr>
+        <w:t>走强</w:t>
+      </w:r>
+      <w:r>
+        <w:rPr>
+          <w:rFonts w:hint="eastAsia"/>
+        </w:rPr>
+        <w:t>' },</w:t>
+      </w:r>
+    </w:p>
+    <w:p>
+      <w:pPr>
+        <w:rPr>
+          <w:rFonts w:hint="eastAsia"/>
+        </w:rPr>
+      </w:pPr>
+      <w:r>
+        <w:rPr>
+          <w:rFonts w:hint="eastAsia"/>
+        </w:rPr>
+        <w:t xml:space="preserve">  { value: -3, label: '-3', range: 'D', desc: '客极致</w:t>
+      </w:r>
+      <w:r>
+        <w:rPr>
+          <w:rFonts w:hint="eastAsia"/>
+          <w:lang w:val="en-US" w:eastAsia="zh-CN"/>
+        </w:rPr>
+        <w:t>火热</w:t>
+      </w:r>
+      <w:r>
+        <w:rPr>
+          <w:rFonts w:hint="eastAsia"/>
+        </w:rPr>
+        <w:t>' },</w:t>
+      </w:r>
+    </w:p>
+    <w:p>
+      <w:pPr>
+        <w:rPr>
+          <w:rFonts w:hint="eastAsia"/>
+        </w:rPr>
+      </w:pPr>
+      <w:r>
+        <w:rPr>
+          <w:rFonts w:hint="eastAsia"/>
+        </w:rPr>
+        <w:t xml:space="preserve">  { value: -4, label: '-4', range: 'D', desc: '客极致</w:t>
+      </w:r>
+      <w:r>
+        <w:rPr>
+          <w:rFonts w:hint="eastAsia"/>
+          <w:lang w:val="en-US" w:eastAsia="zh-CN"/>
+        </w:rPr>
+        <w:t>火热</w:t>
+      </w:r>
+      <w:r>
+        <w:rPr>
+          <w:rFonts w:hint="eastAsia"/>
+        </w:rPr>
+        <w:t>' }</w:t>
+      </w:r>
+    </w:p>
+    <w:p>
+      <w:pPr>
+        <w:rPr>
+          <w:rFonts w:hint="eastAsia"/>
+        </w:rPr>
+      </w:pPr>
+      <w:r>
+        <w:rPr>
+          <w:rFonts w:hint="eastAsia"/>
+        </w:rPr>
+        <w:t>];</w:t>
+      </w:r>
+    </w:p>
+    <w:p/>
+    <w:p>
+      <w:r>
+        <w:rPr>
+          <w:rFonts w:hint="eastAsia"/>
+        </w:rPr>
+        <w:t>一赔稳定性 P-Tie</w:t>
+      </w:r>
+    </w:p>
+    <w:p>
+      <w:pPr>
+        <w:rPr>
+          <w:rFonts w:hint="eastAsia"/>
+        </w:rPr>
+      </w:pPr>
+      <w:r>
+        <w:rPr>
+          <w:rFonts w:hint="eastAsia"/>
+        </w:rPr>
+        <w:t>const stabilityOptions = [</w:t>
+      </w:r>
+    </w:p>
+    <w:p>
+      <w:pPr>
+        <w:rPr>
+          <w:rFonts w:hint="eastAsia"/>
+        </w:rPr>
+      </w:pPr>
+      <w:r>
+        <w:rPr>
+          <w:rFonts w:hint="eastAsia"/>
+        </w:rPr>
+        <w:t xml:space="preserve">  { value: 'S', label: 'S', range: 'P1', desc: '</w:t>
+      </w:r>
+      <w:r>
+        <w:rPr>
+          <w:rFonts w:hint="eastAsia"/>
+          <w:lang w:val="en-US" w:eastAsia="zh-CN"/>
+        </w:rPr>
+        <w:t>正路</w:t>
+      </w:r>
+      <w:r>
+        <w:rPr>
+          <w:rFonts w:hint="eastAsia"/>
+        </w:rPr>
+        <w:t>稳胆' },</w:t>
+      </w:r>
+    </w:p>
+    <w:p>
+      <w:pPr>
+        <w:rPr>
+          <w:rFonts w:hint="eastAsia"/>
+        </w:rPr>
+      </w:pPr>
+      <w:r>
+        <w:rPr>
+          <w:rFonts w:hint="eastAsia"/>
+        </w:rPr>
+        <w:t xml:space="preserve">  { value: 'A', label: 'A', range: 'P2', desc: '</w:t>
+      </w:r>
+      <w:r>
+        <w:rPr>
+          <w:rFonts w:hint="eastAsia"/>
+          <w:lang w:val="en-US" w:eastAsia="zh-CN"/>
+        </w:rPr>
+        <w:t>正路</w:t>
+      </w:r>
+      <w:r>
+        <w:rPr>
+          <w:rFonts w:hint="eastAsia"/>
+        </w:rPr>
+        <w:t>首选' },</w:t>
+      </w:r>
+    </w:p>
+    <w:p>
+      <w:pPr>
+        <w:rPr>
+          <w:rFonts w:hint="eastAsia"/>
+        </w:rPr>
+      </w:pPr>
+      <w:r>
+        <w:rPr>
+          <w:rFonts w:hint="eastAsia"/>
+        </w:rPr>
+        <w:t xml:space="preserve">  { value: 'B', label: 'B', range: 'P3', desc: '</w:t>
+      </w:r>
+      <w:r>
+        <w:rPr>
+          <w:rFonts w:hint="eastAsia"/>
+          <w:lang w:val="en-US" w:eastAsia="zh-CN"/>
+        </w:rPr>
+        <w:t>正路</w:t>
+      </w:r>
+      <w:r>
+        <w:rPr>
+          <w:rFonts w:hint="eastAsia"/>
+        </w:rPr>
+        <w:t>保障' },</w:t>
+      </w:r>
+    </w:p>
+    <w:p>
+      <w:pPr>
+        <w:rPr>
+          <w:rFonts w:hint="eastAsia"/>
+        </w:rPr>
+      </w:pPr>
+      <w:r>
+        <w:rPr>
+          <w:rFonts w:hint="eastAsia"/>
+        </w:rPr>
+        <w:t xml:space="preserve">  { value: 'B-', label: 'B-', range: 'P4', desc: '</w:t>
+      </w:r>
+      <w:r>
+        <w:rPr>
+          <w:rFonts w:hint="eastAsia"/>
+          <w:lang w:val="en-US" w:eastAsia="zh-CN"/>
+        </w:rPr>
+        <w:t>正路</w:t>
+      </w:r>
+      <w:r>
+        <w:rPr>
+          <w:rFonts w:hint="eastAsia"/>
+        </w:rPr>
+        <w:t>分歧' },</w:t>
+      </w:r>
+    </w:p>
+    <w:p>
+      <w:pPr>
+        <w:rPr>
+          <w:rFonts w:hint="eastAsia"/>
+        </w:rPr>
+      </w:pPr>
+      <w:r>
+        <w:rPr>
+          <w:rFonts w:hint="eastAsia"/>
+        </w:rPr>
+        <w:t xml:space="preserve">  { value: 'C', label: 'C', range: 'P5', desc: '</w:t>
+      </w:r>
+      <w:r>
+        <w:rPr>
+          <w:rFonts w:hint="eastAsia"/>
+          <w:lang w:val="en-US" w:eastAsia="zh-CN"/>
+        </w:rPr>
+        <w:t>正路</w:t>
+      </w:r>
+      <w:r>
+        <w:rPr>
+          <w:rFonts w:hint="eastAsia"/>
+        </w:rPr>
+        <w:t>存疑' },</w:t>
+      </w:r>
+    </w:p>
+    <w:p>
+      <w:pPr>
+        <w:rPr>
+          <w:rFonts w:hint="eastAsia"/>
+        </w:rPr>
+      </w:pPr>
+      <w:r>
+        <w:rPr>
+          <w:rFonts w:hint="eastAsia"/>
+        </w:rPr>
+        <w:t xml:space="preserve">  { value: 'D', label: 'D', range: 'P6', desc: '</w:t>
+      </w:r>
+      <w:r>
+        <w:rPr>
+          <w:rFonts w:hint="eastAsia"/>
+          <w:lang w:val="en-US" w:eastAsia="zh-CN"/>
+        </w:rPr>
+        <w:t>正路</w:t>
+      </w:r>
+      <w:r>
+        <w:rPr>
+          <w:rFonts w:hint="eastAsia"/>
+        </w:rPr>
+        <w:t>脆弱' },</w:t>
+      </w:r>
+    </w:p>
+    <w:p>
+      <w:pPr>
+        <w:rPr>
+          <w:rFonts w:hint="eastAsia"/>
+        </w:rPr>
+      </w:pPr>
+      <w:r>
+        <w:rPr>
+          <w:rFonts w:hint="eastAsia"/>
+        </w:rPr>
+        <w:t xml:space="preserve">  { value: 'E', label: 'E', range: 'P7', desc: '</w:t>
+      </w:r>
+      <w:r>
+        <w:rPr>
+          <w:rFonts w:hint="eastAsia"/>
+          <w:lang w:val="en-US" w:eastAsia="zh-CN"/>
+        </w:rPr>
+        <w:t>正路</w:t>
+      </w:r>
+      <w:r>
+        <w:rPr>
+          <w:rFonts w:hint="eastAsia"/>
+        </w:rPr>
+        <w:t>缺失' }</w:t>
       </w:r>
     </w:p>
     <w:p>
@@ -127,472 +958,159 @@
           <w:rFonts w:hint="eastAsia"/>
         </w:rPr>
       </w:pPr>
-      <w:r>
-        <w:rPr>
-          <w:rFonts w:hint="eastAsia"/>
-        </w:rPr>
-        <w:t>const winPanOptions = [</w:t>
-      </w:r>
-    </w:p>
-    <w:p>
-      <w:pPr>
-        <w:rPr>
-          <w:rFonts w:hint="eastAsia"/>
-        </w:rPr>
-      </w:pPr>
-      <w:r>
-        <w:rPr>
-          <w:rFonts w:hint="eastAsia"/>
-        </w:rPr>
-        <w:t xml:space="preserve">  { value: 4, label: '+4', range: 'S', desc: '主极致</w:t>
-      </w:r>
-      <w:r>
-        <w:rPr>
-          <w:rFonts w:hint="eastAsia"/>
-          <w:lang w:val="en-US" w:eastAsia="zh-CN"/>
-        </w:rPr>
-        <w:t>火热</w:t>
-      </w:r>
-      <w:r>
-        <w:rPr>
-          <w:rFonts w:hint="eastAsia"/>
-        </w:rPr>
-        <w:t>' },</w:t>
-      </w:r>
-    </w:p>
-    <w:p>
-      <w:pPr>
-        <w:rPr>
-          <w:rFonts w:hint="eastAsia"/>
-        </w:rPr>
-      </w:pPr>
-      <w:r>
-        <w:rPr>
-          <w:rFonts w:hint="eastAsia"/>
-        </w:rPr>
-        <w:t xml:space="preserve">  { value: 3, label: '+3', range: 'S', desc: '主极致</w:t>
-      </w:r>
-      <w:r>
-        <w:rPr>
-          <w:rFonts w:hint="eastAsia"/>
-          <w:lang w:val="en-US" w:eastAsia="zh-CN"/>
-        </w:rPr>
-        <w:t>火热</w:t>
-      </w:r>
-      <w:r>
-        <w:rPr>
-          <w:rFonts w:hint="eastAsia"/>
-        </w:rPr>
-        <w:t>' },</w:t>
-      </w:r>
-    </w:p>
-    <w:p>
-      <w:pPr>
-        <w:rPr>
-          <w:rFonts w:hint="eastAsia"/>
-        </w:rPr>
-      </w:pPr>
-      <w:r>
-        <w:rPr>
-          <w:rFonts w:hint="eastAsia"/>
-        </w:rPr>
-        <w:t xml:space="preserve">  { value: 2, label: '+2', range: 'A', desc: '主获利</w:t>
-      </w:r>
-      <w:r>
-        <w:rPr>
-          <w:rFonts w:hint="eastAsia"/>
-          <w:lang w:val="en-US" w:eastAsia="zh-CN"/>
-        </w:rPr>
-        <w:t>走强</w:t>
-      </w:r>
-      <w:r>
-        <w:rPr>
-          <w:rFonts w:hint="eastAsia"/>
-        </w:rPr>
-        <w:t>' },</w:t>
-      </w:r>
-    </w:p>
-    <w:p>
-      <w:pPr>
-        <w:rPr>
-          <w:rFonts w:hint="eastAsia"/>
-        </w:rPr>
-      </w:pPr>
-      <w:r>
-        <w:rPr>
-          <w:rFonts w:hint="eastAsia"/>
-        </w:rPr>
-        <w:t xml:space="preserve">  { value: 1, label: '+1', range: 'A', desc: '主获利</w:t>
-      </w:r>
-      <w:r>
-        <w:rPr>
-          <w:rFonts w:hint="eastAsia"/>
-          <w:lang w:val="en-US" w:eastAsia="zh-CN"/>
-        </w:rPr>
-        <w:t>走强</w:t>
-      </w:r>
-      <w:r>
-        <w:rPr>
-          <w:rFonts w:hint="eastAsia"/>
-        </w:rPr>
-        <w:t>' },</w:t>
-      </w:r>
-    </w:p>
-    <w:p>
-      <w:pPr>
-        <w:rPr>
-          <w:rFonts w:hint="eastAsia"/>
-        </w:rPr>
-      </w:pPr>
-      <w:r>
-        <w:rPr>
-          <w:rFonts w:hint="eastAsia"/>
-        </w:rPr>
-        <w:t xml:space="preserve">  { value: 0, label: '0', range: 'B', desc: '</w:t>
-      </w:r>
-      <w:r>
-        <w:rPr>
-          <w:rFonts w:hint="eastAsia"/>
-          <w:lang w:val="en-US" w:eastAsia="zh-CN"/>
-        </w:rPr>
-        <w:t>数据均衡</w:t>
-      </w:r>
-      <w:r>
-        <w:rPr>
-          <w:rFonts w:hint="eastAsia"/>
-        </w:rPr>
-        <w:t>' },</w:t>
-      </w:r>
-    </w:p>
-    <w:p>
-      <w:pPr>
-        <w:rPr>
-          <w:rFonts w:hint="eastAsia"/>
-        </w:rPr>
-      </w:pPr>
-      <w:r>
-        <w:rPr>
-          <w:rFonts w:hint="eastAsia"/>
-        </w:rPr>
-        <w:t xml:space="preserve">  { value: -1, label: '-1', range: 'C', desc: '客获利</w:t>
-      </w:r>
-      <w:r>
-        <w:rPr>
-          <w:rFonts w:hint="eastAsia"/>
-          <w:lang w:val="en-US" w:eastAsia="zh-CN"/>
-        </w:rPr>
-        <w:t>走强</w:t>
-      </w:r>
-      <w:r>
-        <w:rPr>
-          <w:rFonts w:hint="eastAsia"/>
-        </w:rPr>
-        <w:t>' },</w:t>
-      </w:r>
-    </w:p>
-    <w:p>
-      <w:pPr>
-        <w:rPr>
-          <w:rFonts w:hint="eastAsia"/>
-        </w:rPr>
-      </w:pPr>
-      <w:r>
-        <w:rPr>
-          <w:rFonts w:hint="eastAsia"/>
-        </w:rPr>
-        <w:t xml:space="preserve">  { value: -2, label: '-2', range: 'C', desc: '客获利</w:t>
-      </w:r>
-      <w:r>
-        <w:rPr>
-          <w:rFonts w:hint="eastAsia"/>
-          <w:lang w:val="en-US" w:eastAsia="zh-CN"/>
-        </w:rPr>
-        <w:t>走强</w:t>
-      </w:r>
-      <w:r>
-        <w:rPr>
-          <w:rFonts w:hint="eastAsia"/>
-        </w:rPr>
-        <w:t>' },</w:t>
-      </w:r>
-    </w:p>
-    <w:p>
-      <w:pPr>
-        <w:rPr>
-          <w:rFonts w:hint="eastAsia"/>
-        </w:rPr>
-      </w:pPr>
-      <w:r>
-        <w:rPr>
-          <w:rFonts w:hint="eastAsia"/>
-        </w:rPr>
-        <w:t xml:space="preserve">  { value: -3, label: '-3', range: 'D', desc: '客极致</w:t>
-      </w:r>
-      <w:r>
-        <w:rPr>
-          <w:rFonts w:hint="eastAsia"/>
-          <w:lang w:val="en-US" w:eastAsia="zh-CN"/>
-        </w:rPr>
-        <w:t>火热</w:t>
-      </w:r>
-      <w:r>
-        <w:rPr>
-          <w:rFonts w:hint="eastAsia"/>
-        </w:rPr>
-        <w:t>' },</w:t>
-      </w:r>
-    </w:p>
-    <w:p>
-      <w:pPr>
-        <w:rPr>
-          <w:rFonts w:hint="eastAsia"/>
-        </w:rPr>
-      </w:pPr>
-      <w:r>
-        <w:rPr>
-          <w:rFonts w:hint="eastAsia"/>
-        </w:rPr>
-        <w:t xml:space="preserve">  { value: -4, label: '-4', range: 'D', desc: '客极致</w:t>
-      </w:r>
-      <w:r>
-        <w:rPr>
-          <w:rFonts w:hint="eastAsia"/>
-          <w:lang w:val="en-US" w:eastAsia="zh-CN"/>
-        </w:rPr>
-        <w:t>火热</w:t>
-      </w:r>
-      <w:r>
-        <w:rPr>
-          <w:rFonts w:hint="eastAsia"/>
-        </w:rPr>
-        <w:t>' }</w:t>
-      </w:r>
-    </w:p>
-    <w:p>
-      <w:pPr>
-        <w:rPr>
-          <w:rFonts w:hint="eastAsia"/>
-        </w:rPr>
-      </w:pPr>
-      <w:r>
-        <w:rPr>
-          <w:rFonts w:hint="eastAsia"/>
-        </w:rPr>
-        <w:t>];</w:t>
-      </w:r>
-    </w:p>
-    <w:p/>
-    <w:p/>
-    <w:p>
-      <w:pPr>
-        <w:rPr>
-          <w:rFonts w:hint="eastAsia"/>
-        </w:rPr>
-      </w:pPr>
-      <w:r>
-        <w:rPr>
-          <w:rFonts w:hint="eastAsia"/>
-        </w:rPr>
-        <w:t>const stabilityOptions = [</w:t>
-      </w:r>
-    </w:p>
-    <w:p>
-      <w:pPr>
-        <w:rPr>
-          <w:rFonts w:hint="eastAsia"/>
-        </w:rPr>
-      </w:pPr>
-      <w:r>
-        <w:rPr>
-          <w:rFonts w:hint="eastAsia"/>
-        </w:rPr>
-        <w:t xml:space="preserve">  { value: 'S', label: 'S', range: 'P1', desc: '</w:t>
-      </w:r>
-      <w:r>
-        <w:rPr>
-          <w:rFonts w:hint="eastAsia"/>
-          <w:lang w:val="en-US" w:eastAsia="zh-CN"/>
-        </w:rPr>
-        <w:t>正路</w:t>
-      </w:r>
-      <w:r>
-        <w:rPr>
-          <w:rFonts w:hint="eastAsia"/>
-        </w:rPr>
-        <w:t>稳胆' },</w:t>
-      </w:r>
-    </w:p>
-    <w:p>
-      <w:pPr>
-        <w:rPr>
-          <w:rFonts w:hint="eastAsia"/>
-        </w:rPr>
-      </w:pPr>
-      <w:r>
-        <w:rPr>
-          <w:rFonts w:hint="eastAsia"/>
-        </w:rPr>
-        <w:t xml:space="preserve">  { value: 'A', label: 'A', range: 'P2', desc: '</w:t>
-      </w:r>
-      <w:r>
-        <w:rPr>
-          <w:rFonts w:hint="eastAsia"/>
-          <w:lang w:val="en-US" w:eastAsia="zh-CN"/>
-        </w:rPr>
-        <w:t>正路</w:t>
-      </w:r>
-      <w:r>
-        <w:rPr>
-          <w:rFonts w:hint="eastAsia"/>
-        </w:rPr>
-        <w:t>首选' },</w:t>
-      </w:r>
-    </w:p>
-    <w:p>
-      <w:pPr>
-        <w:rPr>
-          <w:rFonts w:hint="eastAsia"/>
-        </w:rPr>
-      </w:pPr>
-      <w:r>
-        <w:rPr>
-          <w:rFonts w:hint="eastAsia"/>
-        </w:rPr>
-        <w:t xml:space="preserve">  { value: 'B', label: 'B', range: 'P3', desc: '</w:t>
-      </w:r>
-      <w:r>
-        <w:rPr>
-          <w:rFonts w:hint="eastAsia"/>
-          <w:lang w:val="en-US" w:eastAsia="zh-CN"/>
-        </w:rPr>
-        <w:t>正路</w:t>
-      </w:r>
-      <w:r>
-        <w:rPr>
-          <w:rFonts w:hint="eastAsia"/>
-        </w:rPr>
-        <w:t>保障' },</w:t>
-      </w:r>
-    </w:p>
-    <w:p>
-      <w:pPr>
-        <w:rPr>
-          <w:rFonts w:hint="eastAsia"/>
-        </w:rPr>
-      </w:pPr>
-      <w:r>
-        <w:rPr>
-          <w:rFonts w:hint="eastAsia"/>
-        </w:rPr>
-        <w:t xml:space="preserve">  { value: 'B-', label: 'B-', range: 'P4', desc: '</w:t>
-      </w:r>
-      <w:r>
-        <w:rPr>
-          <w:rFonts w:hint="eastAsia"/>
-          <w:lang w:val="en-US" w:eastAsia="zh-CN"/>
-        </w:rPr>
-        <w:t>正路</w:t>
-      </w:r>
-      <w:r>
-        <w:rPr>
-          <w:rFonts w:hint="eastAsia"/>
-        </w:rPr>
-        <w:t>分歧' },</w:t>
-      </w:r>
-    </w:p>
-    <w:p>
-      <w:pPr>
-        <w:rPr>
-          <w:rFonts w:hint="eastAsia"/>
-        </w:rPr>
-      </w:pPr>
-      <w:r>
-        <w:rPr>
-          <w:rFonts w:hint="eastAsia"/>
-        </w:rPr>
-        <w:t xml:space="preserve">  { value: 'C', label: 'C', range: 'P5', desc: '</w:t>
-      </w:r>
-      <w:r>
-        <w:rPr>
-          <w:rFonts w:hint="eastAsia"/>
-          <w:lang w:val="en-US" w:eastAsia="zh-CN"/>
-        </w:rPr>
-        <w:t>正路</w:t>
-      </w:r>
-      <w:r>
-        <w:rPr>
-          <w:rFonts w:hint="eastAsia"/>
-        </w:rPr>
-        <w:t>存疑' },</w:t>
-      </w:r>
-    </w:p>
-    <w:p>
-      <w:pPr>
-        <w:rPr>
-          <w:rFonts w:hint="eastAsia"/>
-        </w:rPr>
-      </w:pPr>
-      <w:r>
-        <w:rPr>
-          <w:rFonts w:hint="eastAsia"/>
-        </w:rPr>
-        <w:t xml:space="preserve">  { value: 'D', label: 'D', range: 'P6', desc: '</w:t>
-      </w:r>
-      <w:r>
-        <w:rPr>
-          <w:rFonts w:hint="eastAsia"/>
-          <w:lang w:val="en-US" w:eastAsia="zh-CN"/>
-        </w:rPr>
-        <w:t>正路</w:t>
-      </w:r>
-      <w:r>
-        <w:rPr>
-          <w:rFonts w:hint="eastAsia"/>
-        </w:rPr>
-        <w:t>脆弱' },</w:t>
-      </w:r>
-    </w:p>
-    <w:p>
-      <w:pPr>
-        <w:rPr>
-          <w:rFonts w:hint="eastAsia"/>
-        </w:rPr>
-      </w:pPr>
-      <w:r>
-        <w:rPr>
-          <w:rFonts w:hint="eastAsia"/>
-        </w:rPr>
-        <w:t xml:space="preserve">  { value: 'E', label: 'E', range: 'P7', desc: '</w:t>
-      </w:r>
-      <w:r>
-        <w:rPr>
-          <w:rFonts w:hint="eastAsia"/>
-          <w:lang w:val="en-US" w:eastAsia="zh-CN"/>
-        </w:rPr>
-        <w:t>正路</w:t>
-      </w:r>
-      <w:r>
-        <w:rPr>
-          <w:rFonts w:hint="eastAsia"/>
-        </w:rPr>
-        <w:t>缺失' }</w:t>
-      </w:r>
-    </w:p>
-    <w:p>
-      <w:pPr>
-        <w:rPr>
-          <w:rFonts w:hint="eastAsia"/>
-        </w:rPr>
-      </w:pPr>
-      <w:r>
-        <w:rPr>
-          <w:rFonts w:hint="eastAsia"/>
-        </w:rPr>
-        <w:t>];</w:t>
-      </w:r>
-    </w:p>
-    <w:p/>
-    <w:p/>
+    </w:p>
+    <w:p>
+      <w:pPr>
+        <w:rPr>
+          <w:rFonts w:hint="eastAsia"/>
+          <w:lang w:val="en-US" w:eastAsia="zh-CN"/>
+        </w:rPr>
+      </w:pPr>
+      <w:r>
+        <w:rPr>
+          <w:rFonts w:hint="eastAsia"/>
+        </w:rPr>
+        <w:t>date_time 字段</w:t>
+      </w:r>
+      <w:r>
+        <w:rPr>
+          <w:rFonts w:hint="eastAsia"/>
+          <w:lang w:val="en-US" w:eastAsia="zh-CN"/>
+        </w:rPr>
+        <w:t>格式</w:t>
+      </w:r>
+      <w:r>
+        <w:rPr>
+          <w:rFonts w:hint="eastAsia"/>
+          <w:lang w:eastAsia="zh-CN"/>
+        </w:rPr>
+        <w:t>，</w:t>
+      </w:r>
+      <w:r>
+        <w:rPr>
+          <w:rFonts w:hint="eastAsia"/>
+          <w:lang w:val="en-US" w:eastAsia="zh-CN"/>
+        </w:rPr>
+        <w:t>如：26024（比赛期数）；</w:t>
+      </w:r>
+    </w:p>
+    <w:p>
+      <w:pPr>
+        <w:rPr>
+          <w:rFonts w:hint="eastAsia"/>
+        </w:rPr>
+      </w:pPr>
+      <w:r>
+        <w:rPr>
+          <w:rFonts w:hint="eastAsia"/>
+        </w:rPr>
+        <w:t>比赛ID</w:t>
+      </w:r>
+      <w:r>
+        <w:rPr>
+          <w:rFonts w:hint="eastAsia"/>
+          <w:lang w:val="en-US" w:eastAsia="zh-CN"/>
+        </w:rPr>
+        <w:t>字段，</w:t>
+      </w:r>
+      <w:r>
+        <w:rPr>
+          <w:rFonts w:hint="eastAsia"/>
+        </w:rPr>
+        <w:t>date_time_lineId 的格式</w:t>
+      </w:r>
+      <w:r>
+        <w:rPr>
+          <w:rFonts w:hint="eastAsia"/>
+          <w:lang w:eastAsia="zh-CN"/>
+        </w:rPr>
+        <w:t>，</w:t>
+      </w:r>
+      <w:r>
+        <w:rPr>
+          <w:rFonts w:hint="eastAsia"/>
+          <w:lang w:val="en-US" w:eastAsia="zh-CN"/>
+        </w:rPr>
+        <w:t>如：26024_1;</w:t>
+      </w:r>
+      <w:r>
+        <w:rPr>
+          <w:rFonts w:hint="eastAsia"/>
+        </w:rPr>
+        <w:t>lineId</w:t>
+      </w:r>
+      <w:r>
+        <w:rPr>
+          <w:rFonts w:hint="eastAsia"/>
+          <w:lang w:val="en-US" w:eastAsia="zh-CN"/>
+        </w:rPr>
+        <w:t>取自</w:t>
+      </w:r>
+      <w:r>
+        <w:rPr>
+          <w:rFonts w:hint="eastAsia"/>
+        </w:rPr>
+        <w:t>100球数据源</w:t>
+      </w:r>
+    </w:p>
+    <w:p>
+      <w:pPr>
+        <w:rPr>
+          <w:rFonts w:hint="eastAsia"/>
+        </w:rPr>
+      </w:pPr>
+    </w:p>
+    <w:p>
+      <w:pPr>
+        <w:rPr>
+          <w:rFonts w:ascii="宋体" w:hAnsi="宋体" w:eastAsia="宋体" w:cs="宋体"/>
+          <w:sz w:val="24"/>
+          <w:szCs w:val="24"/>
+        </w:rPr>
+      </w:pPr>
+      <w:r>
+        <w:rPr>
+          <w:rFonts w:ascii="宋体" w:hAnsi="宋体" w:eastAsia="宋体" w:cs="宋体"/>
+          <w:sz w:val="24"/>
+          <w:szCs w:val="24"/>
+        </w:rPr>
+        <w:t>过滤软件.md​ 一些计算方法可以参考这个文件；北单过滤参数.md​ 前端严格按照这个参数来做的，后端也要参考这个，如果计算方法缺失，参考过滤软件.md</w:t>
+      </w:r>
+    </w:p>
+    <w:p>
+      <w:pPr>
+        <w:rPr>
+          <w:rFonts w:ascii="宋体" w:hAnsi="宋体" w:eastAsia="宋体" w:cs="宋体"/>
+          <w:sz w:val="24"/>
+          <w:szCs w:val="24"/>
+        </w:rPr>
+      </w:pPr>
+    </w:p>
+    <w:p>
+      <w:pPr>
+        <w:rPr>
+          <w:rFonts w:ascii="宋体" w:hAnsi="宋体" w:eastAsia="宋体" w:cs="宋体"/>
+          <w:sz w:val="24"/>
+          <w:szCs w:val="24"/>
+        </w:rPr>
+      </w:pPr>
+    </w:p>
+    <w:p>
+      <w:pPr>
+        <w:rPr>
+          <w:rFonts w:hint="eastAsia" w:ascii="宋体" w:hAnsi="宋体" w:eastAsia="宋体" w:cs="宋体"/>
+          <w:sz w:val="24"/>
+          <w:szCs w:val="24"/>
+        </w:rPr>
+      </w:pPr>
+    </w:p>
+    <w:p>
+      <w:pPr>
+        <w:rPr>
+          <w:rFonts w:hint="eastAsia"/>
+        </w:rPr>
+      </w:pPr>
+    </w:p>
     <w:p>
       <w:pPr>
         <w:rPr>
@@ -628,6 +1146,7 @@
     </w:p>
     <w:tbl>
       <w:tblPr>
+        <w:tblStyle w:val="5"/>
         <w:tblW w:w="9180" w:type="dxa"/>
         <w:tblInd w:w="0" w:type="dxa"/>
         <w:tblBorders>
@@ -1894,6 +2413,7 @@
     </w:p>
     <w:tbl>
       <w:tblPr>
+        <w:tblStyle w:val="5"/>
         <w:tblW w:w="9180" w:type="dxa"/>
         <w:tblInd w:w="0" w:type="dxa"/>
         <w:tblBorders>
@@ -1929,6 +2449,7 @@
             <w:insideH w:val="none" w:color="auto" w:sz="0" w:space="0"/>
             <w:insideV w:val="none" w:color="auto" w:sz="0" w:space="0"/>
           </w:tblBorders>
+          <w:shd w:val="clear" w:color="auto" w:fill="F8F8F8"/>
           <w:tblCellMar>
             <w:top w:w="15" w:type="dxa"/>
             <w:left w:w="15" w:type="dxa"/>
@@ -2535,6 +3056,7 @@
             <w:insideH w:val="none" w:color="auto" w:sz="0" w:space="0"/>
             <w:insideV w:val="none" w:color="auto" w:sz="0" w:space="0"/>
           </w:tblBorders>
+          <w:shd w:val="clear" w:color="auto" w:fill="F8F8F8"/>
           <w:tblCellMar>
             <w:top w:w="15" w:type="dxa"/>
             <w:left w:w="15" w:type="dxa"/>
@@ -2629,15 +3151,56 @@
           <w:p>
             <w:pPr>
               <w:rPr>
-                <w:rFonts w:hint="eastAsia"/>
-              </w:rPr>
-            </w:pPr>
-            <w:r>
-              <w:rPr>
-                <w:rFonts w:hint="eastAsia"/>
-                <w:lang w:val="en-US" w:eastAsia="zh-CN"/>
-              </w:rPr>
-              <w:t>点击示例应仅加载条件到三维卡片，不立即应用筛选</w:t>
+                <w:rFonts w:hint="default" w:eastAsia="宋体"/>
+                <w:lang w:val="en-US" w:eastAsia="zh-CN"/>
+              </w:rPr>
+            </w:pPr>
+            <w:r>
+              <w:rPr>
+                <w:rFonts w:ascii="Helvetica" w:hAnsi="Helvetica" w:eastAsia="Helvetica" w:cs="Helvetica"/>
+                <w:b/>
+                <w:bCs/>
+                <w:i w:val="0"/>
+                <w:iCs w:val="0"/>
+                <w:caps w:val="0"/>
+                <w:color w:val="6B6763"/>
+                <w:spacing w:val="0"/>
+                <w:sz w:val="16"/>
+                <w:szCs w:val="16"/>
+                <w:shd w:val="clear" w:fill="F6F5F4"/>
+              </w:rPr>
+              <w:t>策略应用和保存</w:t>
+            </w:r>
+            <w:r>
+              <w:rPr>
+                <w:rFonts w:hint="eastAsia" w:ascii="Helvetica" w:hAnsi="Helvetica" w:eastAsia="宋体" w:cs="Helvetica"/>
+                <w:b/>
+                <w:bCs/>
+                <w:i w:val="0"/>
+                <w:iCs w:val="0"/>
+                <w:caps w:val="0"/>
+                <w:color w:val="6B6763"/>
+                <w:spacing w:val="0"/>
+                <w:sz w:val="16"/>
+                <w:szCs w:val="16"/>
+                <w:shd w:val="clear" w:fill="F6F5F4"/>
+                <w:lang w:val="en-US" w:eastAsia="zh-CN"/>
+              </w:rPr>
+              <w:t>卡片上的：“强势正路”“冷门潜质”“均衡博弈”为示例策略加载，</w:t>
+            </w:r>
+          </w:p>
+          <w:p>
+            <w:pPr>
+              <w:rPr>
+                <w:rFonts w:hint="eastAsia"/>
+              </w:rPr>
+            </w:pPr>
+            <w:r>
+              <w:rPr>
+                <w:rFonts w:hint="eastAsia"/>
+                <w:lang w:val="en-US" w:eastAsia="zh-CN"/>
+              </w:rPr>
+              <w:t>点击上面三个示例仅加载条件到三维卡片，不立即应用筛选</w:t>
             </w:r>
           </w:p>
         </w:tc>
@@ -2836,6 +3399,7 @@
             <w:insideH w:val="none" w:color="auto" w:sz="0" w:space="0"/>
             <w:insideV w:val="none" w:color="auto" w:sz="0" w:space="0"/>
           </w:tblBorders>
+          <w:shd w:val="clear" w:color="auto" w:fill="F8F8F8"/>
           <w:tblCellMar>
             <w:top w:w="15" w:type="dxa"/>
             <w:left w:w="15" w:type="dxa"/>
@@ -2972,156 +3536,6 @@
                 <w:lang w:val="en-US" w:eastAsia="zh-CN"/>
               </w:rPr>
               <w:t>不参与筛选逻辑</w:t>
-            </w:r>
-          </w:p>
-        </w:tc>
-      </w:tr>
-      <w:tr>
-        <w:tblPrEx>
-          <w:tblBorders>
-            <w:top w:val="single" w:color="D0D7DE" w:sz="2" w:space="0"/>
-            <w:left w:val="single" w:color="D0D7DE" w:sz="2" w:space="0"/>
-            <w:bottom w:val="single" w:color="D0D7DE" w:sz="2" w:space="0"/>
-            <w:right w:val="single" w:color="D0D7DE" w:sz="2" w:space="0"/>
-            <w:insideH w:val="none" w:color="auto" w:sz="0" w:space="0"/>
-            <w:insideV w:val="none" w:color="auto" w:sz="0" w:space="0"/>
-          </w:tblBorders>
-          <w:tblCellMar>
-            <w:top w:w="15" w:type="dxa"/>
-            <w:left w:w="15" w:type="dxa"/>
-            <w:bottom w:w="15" w:type="dxa"/>
-            <w:right w:w="15" w:type="dxa"/>
-          </w:tblCellMar>
-        </w:tblPrEx>
-        <w:tc>
-          <w:tcPr>
-            <w:tcW w:w="0" w:type="auto"/>
-            <w:tcBorders>
-              <w:top w:val="single" w:color="D0D7DE" w:sz="2" w:space="0"/>
-              <w:left w:val="single" w:color="D0D7DE" w:sz="2" w:space="0"/>
-              <w:bottom w:val="single" w:color="D0D7DE" w:sz="2" w:space="0"/>
-              <w:right w:val="single" w:color="D0D7DE" w:sz="2" w:space="0"/>
-            </w:tcBorders>
-            <w:shd w:val="clear" w:color="auto" w:fill="F8F8F8"/>
-            <w:tcMar>
-              <w:top w:w="40" w:type="dxa"/>
-              <w:left w:w="40" w:type="dxa"/>
-              <w:bottom w:w="40" w:type="dxa"/>
-              <w:right w:w="40" w:type="dxa"/>
-            </w:tcMar>
-            <w:vAlign w:val="center"/>
-          </w:tcPr>
-          <w:p>
-            <w:pPr>
-              <w:rPr>
-                <w:rFonts w:hint="eastAsia"/>
-              </w:rPr>
-            </w:pPr>
-            <w:r>
-              <w:rPr>
-                <w:rFonts w:hint="eastAsia"/>
-                <w:lang w:val="en-US" w:eastAsia="zh-CN"/>
-              </w:rPr>
-              <w:t>7</w:t>
-            </w:r>
-          </w:p>
-        </w:tc>
-        <w:tc>
-          <w:tcPr>
-            <w:tcW w:w="0" w:type="auto"/>
-            <w:tcBorders>
-              <w:top w:val="single" w:color="D0D7DE" w:sz="2" w:space="0"/>
-              <w:left w:val="single" w:color="D0D7DE" w:sz="2" w:space="0"/>
-              <w:bottom w:val="single" w:color="D0D7DE" w:sz="2" w:space="0"/>
-              <w:right w:val="single" w:color="D0D7DE" w:sz="2" w:space="0"/>
-            </w:tcBorders>
-            <w:shd w:val="clear" w:color="auto" w:fill="F8F8F8"/>
-            <w:tcMar>
-              <w:top w:w="40" w:type="dxa"/>
-              <w:left w:w="40" w:type="dxa"/>
-              <w:bottom w:w="40" w:type="dxa"/>
-              <w:right w:w="40" w:type="dxa"/>
-            </w:tcMar>
-            <w:vAlign w:val="center"/>
-          </w:tcPr>
-          <w:p>
-            <w:pPr>
-              <w:rPr>
-                <w:rFonts w:hint="eastAsia"/>
-              </w:rPr>
-            </w:pPr>
-            <w:r>
-              <w:rPr>
-                <w:rFonts w:hint="eastAsia"/>
-                <w:lang w:val="en-US" w:eastAsia="zh-CN"/>
-              </w:rPr>
-              <w:t>筛选统计 &amp; 结果联动</w:t>
-            </w:r>
-          </w:p>
-        </w:tc>
-        <w:tc>
-          <w:tcPr>
-            <w:tcW w:w="0" w:type="auto"/>
-            <w:tcBorders>
-              <w:top w:val="single" w:color="D0D7DE" w:sz="2" w:space="0"/>
-              <w:left w:val="single" w:color="D0D7DE" w:sz="2" w:space="0"/>
-              <w:bottom w:val="single" w:color="D0D7DE" w:sz="2" w:space="0"/>
-              <w:right w:val="single" w:color="D0D7DE" w:sz="2" w:space="0"/>
-            </w:tcBorders>
-            <w:shd w:val="clear" w:color="auto" w:fill="F8F8F8"/>
-            <w:tcMar>
-              <w:top w:w="40" w:type="dxa"/>
-              <w:left w:w="40" w:type="dxa"/>
-              <w:bottom w:w="40" w:type="dxa"/>
-              <w:right w:w="40" w:type="dxa"/>
-            </w:tcMar>
-            <w:vAlign w:val="center"/>
-          </w:tcPr>
-          <w:p>
-            <w:pPr>
-              <w:rPr>
-                <w:rFonts w:hint="eastAsia"/>
-              </w:rPr>
-            </w:pPr>
-            <w:r>
-              <w:rPr>
-                <w:rFonts w:hint="eastAsia"/>
-                <w:lang w:val="en-US" w:eastAsia="zh-CN"/>
-              </w:rPr>
-              <w:t>选择策略后应通过 applyAdvancedFilter 更新统计与结果，不能用 fetchRealData 覆盖</w:t>
-            </w:r>
-          </w:p>
-        </w:tc>
-        <w:tc>
-          <w:tcPr>
-            <w:tcW w:w="0" w:type="auto"/>
-            <w:tcBorders>
-              <w:top w:val="single" w:color="D0D7DE" w:sz="2" w:space="0"/>
-              <w:left w:val="single" w:color="D0D7DE" w:sz="2" w:space="0"/>
-              <w:bottom w:val="single" w:color="D0D7DE" w:sz="2" w:space="0"/>
-              <w:right w:val="single" w:color="D0D7DE" w:sz="2" w:space="0"/>
-            </w:tcBorders>
-            <w:shd w:val="clear" w:color="auto" w:fill="F8F8F8"/>
-            <w:tcMar>
-              <w:top w:w="40" w:type="dxa"/>
-              <w:left w:w="40" w:type="dxa"/>
-              <w:bottom w:w="40" w:type="dxa"/>
-              <w:right w:w="40" w:type="dxa"/>
-            </w:tcMar>
-            <w:vAlign w:val="center"/>
-          </w:tcPr>
-          <w:p>
-            <w:pPr>
-              <w:rPr>
-                <w:rFonts w:hint="eastAsia"/>
-              </w:rPr>
-            </w:pPr>
-            <w:r>
-              <w:rPr>
-                <w:rFonts w:hint="eastAsia"/>
-                <w:lang w:val="en-US" w:eastAsia="zh-CN"/>
-              </w:rPr>
-              <w:t>需验证无逻辑冲突</w:t>
             </w:r>
           </w:p>
         </w:tc>
@@ -3173,6 +3587,157 @@
                 <w:rFonts w:hint="eastAsia"/>
                 <w:lang w:val="en-US" w:eastAsia="zh-CN"/>
               </w:rPr>
+              <w:t>7</w:t>
+            </w:r>
+          </w:p>
+        </w:tc>
+        <w:tc>
+          <w:tcPr>
+            <w:tcW w:w="0" w:type="auto"/>
+            <w:tcBorders>
+              <w:top w:val="single" w:color="D0D7DE" w:sz="2" w:space="0"/>
+              <w:left w:val="single" w:color="D0D7DE" w:sz="2" w:space="0"/>
+              <w:bottom w:val="single" w:color="D0D7DE" w:sz="2" w:space="0"/>
+              <w:right w:val="single" w:color="D0D7DE" w:sz="2" w:space="0"/>
+            </w:tcBorders>
+            <w:shd w:val="clear" w:color="auto" w:fill="F8F8F8"/>
+            <w:tcMar>
+              <w:top w:w="40" w:type="dxa"/>
+              <w:left w:w="40" w:type="dxa"/>
+              <w:bottom w:w="40" w:type="dxa"/>
+              <w:right w:w="40" w:type="dxa"/>
+            </w:tcMar>
+            <w:vAlign w:val="center"/>
+          </w:tcPr>
+          <w:p>
+            <w:pPr>
+              <w:rPr>
+                <w:rFonts w:hint="eastAsia"/>
+              </w:rPr>
+            </w:pPr>
+            <w:r>
+              <w:rPr>
+                <w:rFonts w:hint="eastAsia"/>
+                <w:lang w:val="en-US" w:eastAsia="zh-CN"/>
+              </w:rPr>
+              <w:t>筛选统计 &amp; 结果联动</w:t>
+            </w:r>
+          </w:p>
+        </w:tc>
+        <w:tc>
+          <w:tcPr>
+            <w:tcW w:w="0" w:type="auto"/>
+            <w:tcBorders>
+              <w:top w:val="single" w:color="D0D7DE" w:sz="2" w:space="0"/>
+              <w:left w:val="single" w:color="D0D7DE" w:sz="2" w:space="0"/>
+              <w:bottom w:val="single" w:color="D0D7DE" w:sz="2" w:space="0"/>
+              <w:right w:val="single" w:color="D0D7DE" w:sz="2" w:space="0"/>
+            </w:tcBorders>
+            <w:shd w:val="clear" w:color="auto" w:fill="F8F8F8"/>
+            <w:tcMar>
+              <w:top w:w="40" w:type="dxa"/>
+              <w:left w:w="40" w:type="dxa"/>
+              <w:bottom w:w="40" w:type="dxa"/>
+              <w:right w:w="40" w:type="dxa"/>
+            </w:tcMar>
+            <w:vAlign w:val="center"/>
+          </w:tcPr>
+          <w:p>
+            <w:pPr>
+              <w:rPr>
+                <w:rFonts w:hint="eastAsia"/>
+              </w:rPr>
+            </w:pPr>
+            <w:r>
+              <w:rPr>
+                <w:rFonts w:hint="eastAsia"/>
+                <w:lang w:val="en-US" w:eastAsia="zh-CN"/>
+              </w:rPr>
+              <w:t>选择策略后应通过 applyAdvancedFilter 更新统计与结果，不能用 fetchRealData 覆盖</w:t>
+            </w:r>
+          </w:p>
+        </w:tc>
+        <w:tc>
+          <w:tcPr>
+            <w:tcW w:w="0" w:type="auto"/>
+            <w:tcBorders>
+              <w:top w:val="single" w:color="D0D7DE" w:sz="2" w:space="0"/>
+              <w:left w:val="single" w:color="D0D7DE" w:sz="2" w:space="0"/>
+              <w:bottom w:val="single" w:color="D0D7DE" w:sz="2" w:space="0"/>
+              <w:right w:val="single" w:color="D0D7DE" w:sz="2" w:space="0"/>
+            </w:tcBorders>
+            <w:shd w:val="clear" w:color="auto" w:fill="F8F8F8"/>
+            <w:tcMar>
+              <w:top w:w="40" w:type="dxa"/>
+              <w:left w:w="40" w:type="dxa"/>
+              <w:bottom w:w="40" w:type="dxa"/>
+              <w:right w:w="40" w:type="dxa"/>
+            </w:tcMar>
+            <w:vAlign w:val="center"/>
+          </w:tcPr>
+          <w:p>
+            <w:pPr>
+              <w:rPr>
+                <w:rFonts w:hint="eastAsia"/>
+              </w:rPr>
+            </w:pPr>
+            <w:r>
+              <w:rPr>
+                <w:rFonts w:hint="eastAsia"/>
+                <w:lang w:val="en-US" w:eastAsia="zh-CN"/>
+              </w:rPr>
+              <w:t>需验证无逻辑冲突</w:t>
+            </w:r>
+          </w:p>
+        </w:tc>
+      </w:tr>
+      <w:tr>
+        <w:tblPrEx>
+          <w:tblBorders>
+            <w:top w:val="single" w:color="D0D7DE" w:sz="2" w:space="0"/>
+            <w:left w:val="single" w:color="D0D7DE" w:sz="2" w:space="0"/>
+            <w:bottom w:val="single" w:color="D0D7DE" w:sz="2" w:space="0"/>
+            <w:right w:val="single" w:color="D0D7DE" w:sz="2" w:space="0"/>
+            <w:insideH w:val="none" w:color="auto" w:sz="0" w:space="0"/>
+            <w:insideV w:val="none" w:color="auto" w:sz="0" w:space="0"/>
+          </w:tblBorders>
+          <w:shd w:val="clear" w:color="auto" w:fill="F8F8F8"/>
+          <w:tblCellMar>
+            <w:top w:w="15" w:type="dxa"/>
+            <w:left w:w="15" w:type="dxa"/>
+            <w:bottom w:w="15" w:type="dxa"/>
+            <w:right w:w="15" w:type="dxa"/>
+          </w:tblCellMar>
+        </w:tblPrEx>
+        <w:tc>
+          <w:tcPr>
+            <w:tcW w:w="0" w:type="auto"/>
+            <w:tcBorders>
+              <w:top w:val="single" w:color="D0D7DE" w:sz="2" w:space="0"/>
+              <w:left w:val="single" w:color="D0D7DE" w:sz="2" w:space="0"/>
+              <w:bottom w:val="single" w:color="D0D7DE" w:sz="2" w:space="0"/>
+              <w:right w:val="single" w:color="D0D7DE" w:sz="2" w:space="0"/>
+            </w:tcBorders>
+            <w:shd w:val="clear" w:color="auto" w:fill="F8F8F8"/>
+            <w:tcMar>
+              <w:top w:w="40" w:type="dxa"/>
+              <w:left w:w="40" w:type="dxa"/>
+              <w:bottom w:w="40" w:type="dxa"/>
+              <w:right w:w="40" w:type="dxa"/>
+            </w:tcMar>
+            <w:vAlign w:val="center"/>
+          </w:tcPr>
+          <w:p>
+            <w:pPr>
+              <w:rPr>
+                <w:rFonts w:hint="eastAsia"/>
+              </w:rPr>
+            </w:pPr>
+            <w:r>
+              <w:rPr>
+                <w:rFonts w:hint="eastAsia"/>
+                <w:lang w:val="en-US" w:eastAsia="zh-CN"/>
+              </w:rPr>
               <w:t>8</w:t>
             </w:r>
           </w:p>
@@ -3293,6 +3858,7 @@
     </w:p>
     <w:tbl>
       <w:tblPr>
+        <w:tblStyle w:val="5"/>
         <w:tblW w:w="9180" w:type="dxa"/>
         <w:tblInd w:w="0" w:type="dxa"/>
         <w:tblBorders>
@@ -3785,6 +4351,12 @@
             <w:insideV w:val="none" w:color="auto" w:sz="0" w:space="0"/>
           </w:tblBorders>
           <w:shd w:val="clear" w:color="auto" w:fill="F8F8F8"/>
+          <w:tblCellMar>
+            <w:top w:w="15" w:type="dxa"/>
+            <w:left w:w="15" w:type="dxa"/>
+            <w:bottom w:w="15" w:type="dxa"/>
+            <w:right w:w="15" w:type="dxa"/>
+          </w:tblCellMar>
         </w:tblPrEx>
         <w:tc>
           <w:tcPr>
@@ -4713,7 +5285,7 @@
           <w:rFonts w:hint="eastAsia"/>
         </w:rPr>
         <w:pict>
-          <v:rect id="_x0000_i1031" o:spt="1" style="height:1.5pt;width:432pt;" fillcolor="#A0A0A0" filled="t" stroked="f" coordsize="21600,21600" o:hr="t" o:hrstd="t" o:hralign="center">
+          <v:rect id="_x0000_i1025" o:spt="1" style="height:1.5pt;width:432pt;" fillcolor="#A0A0A0" filled="t" stroked="f" coordsize="21600,21600" o:hr="t" o:hrstd="t" o:hralign="center">
             <v:path/>
             <v:fill on="t" focussize="0,0"/>
             <v:stroke on="f"/>
@@ -4748,7 +5320,30 @@
     <w:p>
       <w:pPr>
         <w:rPr>
-          <w:rFonts w:hint="eastAsia"/>
+          <w:rFonts w:hint="default" w:eastAsiaTheme="minorEastAsia"/>
+          <w:lang w:val="en-US" w:eastAsia="zh-CN"/>
+        </w:rPr>
+      </w:pPr>
+      <w:r>
+        <w:rPr>
+          <w:rFonts w:hint="eastAsia"/>
+          <w:lang w:val="en-US" w:eastAsia="zh-CN"/>
+        </w:rPr>
+        <w:t>明确名为“当前策略”的逻辑概念</w:t>
+      </w:r>
+    </w:p>
+    <w:p>
+      <w:pPr>
+        <w:rPr>
+          <w:rFonts w:hint="eastAsia"/>
+        </w:rPr>
+      </w:pPr>
+    </w:p>
+    <w:p>
+      <w:pPr>
+        <w:rPr>
+          <w:rFonts w:hint="default" w:eastAsiaTheme="minorEastAsia"/>
+          <w:lang w:val="en-US" w:eastAsia="zh-CN"/>
         </w:rPr>
       </w:pPr>
       <w:r>
@@ -4779,41 +5374,192 @@
         <w:rPr>
           <w:rFonts w:hint="eastAsia"/>
         </w:rPr>
-        <w:t>→ 生成 “当前应用” 临时策略。</w:t>
-      </w:r>
-    </w:p>
-    <w:p>
-      <w:pPr>
-        <w:rPr>
-          <w:rFonts w:hint="eastAsia"/>
-        </w:rPr>
-      </w:pPr>
-    </w:p>
-    <w:p>
-      <w:pPr>
-        <w:rPr>
-          <w:rFonts w:hint="eastAsia"/>
-        </w:rPr>
-      </w:pPr>
-    </w:p>
-    <w:p>
-      <w:pPr>
-        <w:rPr>
-          <w:rFonts w:hint="eastAsia"/>
-        </w:rPr>
-      </w:pPr>
-      <w:r>
-        <w:rPr>
-          <w:rFonts w:hint="eastAsia"/>
-        </w:rPr>
-        <w:t>在 策略筛选卡片（下拉栏或策略列表）选择 “当前应用” 或某个已保存策略</w:t>
-      </w:r>
-      <w:r>
-        <w:rPr>
-          <w:rFonts w:hint="eastAsia"/>
-        </w:rPr>
-        <w:br w:type="textWrapping"/>
-      </w:r>
+        <w:t>→ 生成 “当前</w:t>
+      </w:r>
+      <w:r>
+        <w:rPr>
+          <w:rFonts w:hint="eastAsia"/>
+          <w:lang w:val="en-US" w:eastAsia="zh-CN"/>
+        </w:rPr>
+        <w:t>策略</w:t>
+      </w:r>
+      <w:r>
+        <w:rPr>
+          <w:rFonts w:hint="eastAsia"/>
+        </w:rPr>
+        <w:t>” 临时策略。</w:t>
+      </w:r>
+      <w:r>
+        <w:rPr>
+          <w:rFonts w:hint="eastAsia"/>
+          <w:lang w:val="en-US" w:eastAsia="zh-CN"/>
+        </w:rPr>
+        <w:t>是在保存策略前的一种临时策略。</w:t>
+      </w:r>
+    </w:p>
+    <w:p>
+      <w:pPr>
+        <w:rPr>
+          <w:rFonts w:hint="eastAsia"/>
+        </w:rPr>
+      </w:pPr>
+    </w:p>
+    <w:p>
+      <w:pPr>
+        <w:rPr>
+          <w:rFonts w:hint="default"/>
+          <w:lang w:val="en-US" w:eastAsia="zh-CN"/>
+        </w:rPr>
+      </w:pPr>
+      <w:r>
+        <w:rPr>
+          <w:rFonts w:hint="eastAsia"/>
+          <w:lang w:val="en-US" w:eastAsia="zh-CN"/>
+        </w:rPr>
+        <w:t>“当前策略”状态下，</w:t>
+      </w:r>
+      <w:r>
+        <w:rPr>
+          <w:rFonts w:hint="eastAsia"/>
+        </w:rPr>
+        <w:t>在 策略筛选</w:t>
+      </w:r>
+      <w:r>
+        <w:rPr>
+          <w:rFonts w:hint="eastAsia"/>
+          <w:lang w:val="en-US" w:eastAsia="zh-CN"/>
+        </w:rPr>
+        <w:t>卡片的</w:t>
+      </w:r>
+      <w:r>
+        <w:rPr>
+          <w:rFonts w:hint="eastAsia"/>
+        </w:rPr>
+        <w:t>下拉栏</w:t>
+      </w:r>
+      <w:r>
+        <w:rPr>
+          <w:rFonts w:hint="eastAsia"/>
+          <w:lang w:val="en-US" w:eastAsia="zh-CN"/>
+        </w:rPr>
+        <w:t>处于无策略选择状态，</w:t>
+      </w:r>
+      <w:r>
+        <w:rPr>
+          <w:rFonts w:hint="eastAsia"/>
+        </w:rPr>
+        <w:t>策略列表</w:t>
+      </w:r>
+      <w:r>
+        <w:rPr>
+          <w:rFonts w:hint="eastAsia"/>
+          <w:lang w:val="en-US" w:eastAsia="zh-CN"/>
+        </w:rPr>
+        <w:t>会多一个</w:t>
+      </w:r>
+      <w:r>
+        <w:rPr>
+          <w:rFonts w:hint="eastAsia"/>
+        </w:rPr>
+        <w:t>“当前</w:t>
+      </w:r>
+      <w:r>
+        <w:rPr>
+          <w:rFonts w:hint="eastAsia"/>
+          <w:lang w:val="en-US" w:eastAsia="zh-CN"/>
+        </w:rPr>
+        <w:t>策略</w:t>
+      </w:r>
+      <w:r>
+        <w:rPr>
+          <w:rFonts w:hint="eastAsia"/>
+        </w:rPr>
+        <w:t>” </w:t>
+      </w:r>
+      <w:r>
+        <w:rPr>
+          <w:rFonts w:hint="eastAsia"/>
+          <w:lang w:val="en-US" w:eastAsia="zh-CN"/>
+        </w:rPr>
+        <w:t>卡片，当用户点击当前策略，显示已选状态，并且作用于筛选统计和筛选结果；在已选状态下，三维卡片栏里的选择是保持的；</w:t>
+      </w:r>
+    </w:p>
+    <w:p>
+      <w:pPr>
+        <w:rPr>
+          <w:rFonts w:hint="eastAsia"/>
+          <w:lang w:val="en-US" w:eastAsia="zh-CN"/>
+        </w:rPr>
+      </w:pPr>
+      <w:r>
+        <w:rPr>
+          <w:rFonts w:hint="eastAsia"/>
+          <w:lang w:val="en-US" w:eastAsia="zh-CN"/>
+        </w:rPr>
+        <w:t>在用户未点击当前策略卡片时，也就是“当前策略”未选状态下，不会作用于筛选统计和筛选结果；</w:t>
+      </w:r>
+    </w:p>
+    <w:p>
+      <w:pPr>
+        <w:rPr>
+          <w:rFonts w:hint="default"/>
+          <w:lang w:val="en-US" w:eastAsia="zh-CN"/>
+        </w:rPr>
+      </w:pPr>
+      <w:r>
+        <w:rPr>
+          <w:rFonts w:hint="eastAsia"/>
+          <w:lang w:val="en-US" w:eastAsia="zh-CN"/>
+        </w:rPr>
+        <w:t>当用户点击重置后，当前策略卡片在策略列表里消失，筛选统计和筛选结果也处于隐藏状态；</w:t>
+      </w:r>
+    </w:p>
+    <w:p>
+      <w:pPr>
+        <w:rPr>
+          <w:rFonts w:hint="default"/>
+          <w:lang w:val="en-US" w:eastAsia="zh-CN"/>
+        </w:rPr>
+      </w:pPr>
+      <w:r>
+        <w:rPr>
+          <w:rFonts w:ascii="宋体" w:hAnsi="宋体" w:eastAsia="宋体" w:cs="宋体"/>
+          <w:sz w:val="24"/>
+          <w:szCs w:val="24"/>
+        </w:rPr>
+        <w:t>一个验证条件就是当三维条件清空状态下，“当前策略”卡片是不会出现在策略列表里的；</w:t>
+      </w:r>
+    </w:p>
+    <w:p>
+      <w:pPr>
+        <w:rPr>
+          <w:rFonts w:hint="default"/>
+          <w:lang w:val="en-US" w:eastAsia="zh-CN"/>
+        </w:rPr>
+      </w:pPr>
+      <w:r>
+        <w:rPr>
+          <w:rFonts w:ascii="宋体" w:hAnsi="宋体" w:eastAsia="宋体" w:cs="宋体"/>
+          <w:sz w:val="24"/>
+          <w:szCs w:val="24"/>
+        </w:rPr>
+        <w:t>当用户刷新页面时候“当前策略”卡片也应该消失，和重置按钮的效果一样，因为三维条件属于未选择状态；</w:t>
+      </w:r>
+    </w:p>
+    <w:p>
+      <w:pPr>
+        <w:rPr>
+          <w:rFonts w:hint="eastAsia"/>
+          <w:lang w:val="en-US" w:eastAsia="zh-CN"/>
+        </w:rPr>
+      </w:pPr>
+    </w:p>
+    <w:p>
+      <w:pPr>
+        <w:rPr>
+          <w:rFonts w:hint="eastAsia"/>
+        </w:rPr>
+      </w:pPr>
       <w:r>
         <w:rPr>
           <w:rFonts w:hint="eastAsia"/>
@@ -4893,7 +5639,7 @@
           <w:rFonts w:hint="eastAsia"/>
         </w:rPr>
         <w:pict>
-          <v:rect id="_x0000_i1032" o:spt="1" style="height:1.5pt;width:432pt;" fillcolor="#A0A0A0" filled="t" stroked="f" coordsize="21600,21600" o:hr="t" o:hrstd="t" o:hralign="center">
+          <v:rect id="_x0000_i1026" o:spt="1" style="height:1.5pt;width:432pt;" fillcolor="#A0A0A0" filled="t" stroked="f" coordsize="21600,21600" o:hr="t" o:hrstd="t" o:hralign="center">
             <v:path/>
             <v:fill on="t" focussize="0,0"/>
             <v:stroke on="f"/>
@@ -4948,14 +5694,22 @@
     <w:p>
       <w:pPr>
         <w:rPr>
-          <w:rFonts w:hint="eastAsia"/>
-        </w:rPr>
-      </w:pPr>
-      <w:r>
-        <w:rPr>
-          <w:rFonts w:hint="eastAsia"/>
-        </w:rPr>
-        <w:t>原“快捷组合” → 改为 “策略应用和保存”。</w:t>
+          <w:rFonts w:hint="eastAsia" w:eastAsiaTheme="minorEastAsia"/>
+          <w:lang w:val="en-US" w:eastAsia="zh-CN"/>
+        </w:rPr>
+      </w:pPr>
+      <w:r>
+        <w:rPr>
+          <w:rFonts w:hint="eastAsia"/>
+        </w:rPr>
+        <w:t>“策略应用和保存”</w:t>
+      </w:r>
+      <w:r>
+        <w:rPr>
+          <w:rFonts w:hint="eastAsia"/>
+          <w:lang w:val="en-US" w:eastAsia="zh-CN"/>
+        </w:rPr>
+        <w:t>卡片</w:t>
       </w:r>
     </w:p>
     <w:p>
@@ -4995,7 +5749,20 @@
         <w:rPr>
           <w:rFonts w:hint="eastAsia"/>
         </w:rPr>
-        <w:t>这是用户对策略进行 应用、保存、加载后覆盖策略和删除策略 的操作区域。</w:t>
+        <w:t>这是用户对策略进行应用、保存、</w:t>
+      </w:r>
+      <w:r>
+        <w:rPr>
+          <w:rFonts w:hint="eastAsia"/>
+          <w:lang w:val="en-US" w:eastAsia="zh-CN"/>
+        </w:rPr>
+        <w:t>修改</w:t>
+      </w:r>
+      <w:r>
+        <w:rPr>
+          <w:rFonts w:hint="eastAsia"/>
+        </w:rPr>
+        <w:t>和删除策略 的操作区域。</w:t>
       </w:r>
     </w:p>
     <w:p>
@@ -5021,33 +5788,79 @@
         <w:rPr>
           <w:rFonts w:hint="eastAsia"/>
         </w:rPr>
-        <w:t>应用（把示例或已有策略加载到三维条件卡片中）</w:t>
-      </w:r>
-    </w:p>
-    <w:p>
-      <w:pPr>
-        <w:rPr>
-          <w:rFonts w:hint="eastAsia"/>
-        </w:rPr>
-      </w:pPr>
-      <w:r>
-        <w:rPr>
-          <w:rFonts w:hint="eastAsia"/>
-        </w:rPr>
-        <w:t>保存（把当前三维条件保存为新策略或覆盖已有策略）</w:t>
-      </w:r>
-    </w:p>
-    <w:p>
-      <w:pPr>
-        <w:rPr>
-          <w:rFonts w:hint="eastAsia"/>
-        </w:rPr>
-      </w:pPr>
-      <w:r>
-        <w:rPr>
-          <w:rFonts w:hint="eastAsia"/>
-        </w:rPr>
-        <w:t>加载后覆盖策略（将已有策略应用到三维条件并覆盖当前设置）</w:t>
+        <w:t>应用</w:t>
+      </w:r>
+      <w:r>
+        <w:rPr>
+          <w:rFonts w:hint="eastAsia"/>
+          <w:lang w:val="en-US" w:eastAsia="zh-CN"/>
+        </w:rPr>
+        <w:t>策略</w:t>
+      </w:r>
+      <w:r>
+        <w:rPr>
+          <w:rFonts w:hint="eastAsia"/>
+        </w:rPr>
+        <w:t>（</w:t>
+      </w:r>
+      <w:r>
+        <w:rPr>
+          <w:rFonts w:hint="eastAsia"/>
+          <w:lang w:val="en-US" w:eastAsia="zh-CN"/>
+        </w:rPr>
+        <w:t>生成“当前策略”</w:t>
+      </w:r>
+      <w:r>
+        <w:rPr>
+          <w:rFonts w:hint="eastAsia"/>
+        </w:rPr>
+        <w:t>）</w:t>
+      </w:r>
+    </w:p>
+    <w:p>
+      <w:pPr>
+        <w:rPr>
+          <w:rFonts w:hint="eastAsia"/>
+        </w:rPr>
+      </w:pPr>
+      <w:r>
+        <w:rPr>
+          <w:rFonts w:hint="eastAsia"/>
+        </w:rPr>
+        <w:t>保存（把当前三维条件保存为新策略）</w:t>
+      </w:r>
+    </w:p>
+    <w:p>
+      <w:pPr>
+        <w:rPr>
+          <w:rFonts w:hint="eastAsia"/>
+        </w:rPr>
+      </w:pPr>
+      <w:r>
+        <w:rPr>
+          <w:rFonts w:hint="eastAsia"/>
+          <w:lang w:val="en-US" w:eastAsia="zh-CN"/>
+        </w:rPr>
+        <w:t>修改</w:t>
+      </w:r>
+      <w:r>
+        <w:rPr>
+          <w:rFonts w:hint="eastAsia"/>
+        </w:rPr>
+        <w:t>策略（将已有策略</w:t>
+      </w:r>
+      <w:r>
+        <w:rPr>
+          <w:rFonts w:hint="eastAsia"/>
+          <w:lang w:val="en-US" w:eastAsia="zh-CN"/>
+        </w:rPr>
+        <w:t>进行修改条件</w:t>
+      </w:r>
+      <w:r>
+        <w:rPr>
+          <w:rFonts w:hint="eastAsia"/>
+        </w:rPr>
+        <w:t>）</w:t>
       </w:r>
     </w:p>
     <w:p>
@@ -5101,7 +5914,7 @@
           <w:rFonts w:hint="eastAsia"/>
         </w:rPr>
         <w:pict>
-          <v:rect id="_x0000_i1033" o:spt="1" style="height:1.5pt;width:432pt;" fillcolor="#A0A0A0" filled="t" stroked="f" coordsize="21600,21600" o:hr="t" o:hrstd="t" o:hralign="center">
+          <v:rect id="_x0000_i1027" o:spt="1" style="height:1.5pt;width:432pt;" fillcolor="#A0A0A0" filled="t" stroked="f" coordsize="21600,21600" o:hr="t" o:hrstd="t" o:hralign="center">
             <v:path/>
             <v:fill on="t" focussize="0,0"/>
             <v:stroke on="f"/>
@@ -5188,17 +6001,945 @@
         <w:rPr>
           <w:rFonts w:hint="eastAsia"/>
         </w:rPr>
-        <w:t>用户仍需手动点击 “应用筛选” 才会生成“当前应用”临时策略并作用于统计和结果。</w:t>
-      </w:r>
-    </w:p>
-    <w:p>
-      <w:pPr>
-        <w:rPr>
-          <w:rFonts w:hint="eastAsia"/>
-        </w:rPr>
-      </w:pPr>
-      <w:bookmarkStart w:id="0" w:name="_GoBack"/>
-      <w:bookmarkEnd w:id="0"/>
+        <w:t>用户仍需手动点击 “应用筛选” 才会生成“当前</w:t>
+      </w:r>
+      <w:r>
+        <w:rPr>
+          <w:rFonts w:hint="eastAsia"/>
+          <w:lang w:val="en-US" w:eastAsia="zh-CN"/>
+        </w:rPr>
+        <w:t>策略</w:t>
+      </w:r>
+      <w:r>
+        <w:rPr>
+          <w:rFonts w:hint="eastAsia"/>
+        </w:rPr>
+        <w:t>”</w:t>
+      </w:r>
+      <w:r>
+        <w:rPr>
+          <w:rFonts w:hint="eastAsia"/>
+          <w:lang w:val="en-US" w:eastAsia="zh-CN"/>
+        </w:rPr>
+        <w:t>的</w:t>
+      </w:r>
+      <w:r>
+        <w:rPr>
+          <w:rFonts w:hint="eastAsia"/>
+        </w:rPr>
+        <w:t>临时策略并作用于统计和结果。</w:t>
+      </w:r>
+    </w:p>
+    <w:p>
+      <w:pPr>
+        <w:rPr>
+          <w:rFonts w:hint="eastAsia"/>
+        </w:rPr>
+      </w:pPr>
+    </w:p>
+    <w:p>
+      <w:pPr>
+        <w:keepNext w:val="0"/>
+        <w:keepLines w:val="0"/>
+        <w:widowControl/>
+        <w:suppressLineNumbers w:val="0"/>
+        <w:jc w:val="left"/>
+        <w:rPr>
+          <w:rFonts w:hint="eastAsia" w:ascii="宋体" w:hAnsi="宋体" w:eastAsia="宋体" w:cs="宋体"/>
+          <w:kern w:val="0"/>
+          <w:sz w:val="24"/>
+          <w:szCs w:val="24"/>
+          <w:lang w:val="en-US" w:eastAsia="zh-CN" w:bidi="ar"/>
+        </w:rPr>
+      </w:pPr>
+      <w:r>
+        <w:rPr>
+          <w:rFonts w:hint="eastAsia" w:ascii="宋体" w:hAnsi="宋体" w:eastAsia="宋体" w:cs="宋体"/>
+          <w:kern w:val="0"/>
+          <w:sz w:val="24"/>
+          <w:szCs w:val="24"/>
+          <w:lang w:val="en-US" w:eastAsia="zh-CN" w:bidi="ar"/>
+        </w:rPr>
+        <w:t>以下是三个示例策略的选择条件参照，</w:t>
+      </w:r>
+    </w:p>
+    <w:p>
+      <w:pPr>
+        <w:keepNext w:val="0"/>
+        <w:keepLines w:val="0"/>
+        <w:widowControl/>
+        <w:suppressLineNumbers w:val="0"/>
+        <w:jc w:val="left"/>
+        <w:rPr>
+          <w:rFonts w:hint="eastAsia"/>
+        </w:rPr>
+      </w:pPr>
+      <w:r>
+        <w:rPr>
+          <w:rFonts w:hint="eastAsia"/>
+        </w:rPr>
+        <w:t>实力等级差 ΔP</w:t>
+      </w:r>
+    </w:p>
+    <w:p>
+      <w:pPr>
+        <w:keepNext w:val="0"/>
+        <w:keepLines w:val="0"/>
+        <w:widowControl/>
+        <w:suppressLineNumbers w:val="0"/>
+        <w:jc w:val="left"/>
+      </w:pPr>
+      <w:r>
+        <w:rPr>
+          <w:rFonts w:hint="eastAsia"/>
+        </w:rPr>
+        <w:t>赢盘等级差 ΔWP</w:t>
+      </w:r>
+    </w:p>
+    <w:p>
+      <w:pPr>
+        <w:keepNext w:val="0"/>
+        <w:keepLines w:val="0"/>
+        <w:widowControl/>
+        <w:suppressLineNumbers w:val="0"/>
+        <w:jc w:val="left"/>
+        <w:rPr>
+          <w:rFonts w:hint="eastAsia"/>
+        </w:rPr>
+      </w:pPr>
+      <w:r>
+        <w:rPr>
+          <w:rFonts w:hint="eastAsia"/>
+        </w:rPr>
+        <w:t>一赔稳定性 P-Tier</w:t>
+      </w:r>
+    </w:p>
+    <w:p>
+      <w:pPr>
+        <w:keepNext w:val="0"/>
+        <w:keepLines w:val="0"/>
+        <w:widowControl/>
+        <w:suppressLineNumbers w:val="0"/>
+        <w:jc w:val="left"/>
+      </w:pPr>
+      <w:r>
+        <w:rPr>
+          <w:rStyle w:val="7"/>
+          <w:rFonts w:ascii="宋体" w:hAnsi="宋体" w:eastAsia="宋体" w:cs="宋体"/>
+          <w:kern w:val="0"/>
+          <w:sz w:val="24"/>
+          <w:szCs w:val="24"/>
+          <w:lang w:val="en-US" w:eastAsia="zh-CN" w:bidi="ar"/>
+        </w:rPr>
+        <w:t>强势正路</w:t>
+      </w:r>
+      <w:r>
+        <w:rPr>
+          <w:rFonts w:ascii="宋体" w:hAnsi="宋体" w:eastAsia="宋体" w:cs="宋体"/>
+          <w:kern w:val="0"/>
+          <w:sz w:val="24"/>
+          <w:szCs w:val="24"/>
+          <w:lang w:val="en-US" w:eastAsia="zh-CN" w:bidi="ar"/>
+        </w:rPr>
+        <w:t>​</w:t>
+      </w:r>
+    </w:p>
+    <w:p>
+      <w:pPr>
+        <w:keepNext w:val="0"/>
+        <w:keepLines w:val="0"/>
+        <w:widowControl/>
+        <w:suppressLineNumbers w:val="0"/>
+        <w:jc w:val="left"/>
+        <w:rPr>
+          <w:rFonts w:ascii="宋体" w:hAnsi="宋体" w:eastAsia="宋体" w:cs="宋体"/>
+          <w:kern w:val="0"/>
+          <w:sz w:val="24"/>
+          <w:szCs w:val="24"/>
+          <w:lang w:val="en-US" w:eastAsia="zh-CN" w:bidi="ar"/>
+        </w:rPr>
+      </w:pPr>
+      <w:r>
+        <w:rPr>
+          <w:rFonts w:ascii="宋体" w:hAnsi="宋体" w:eastAsia="宋体" w:cs="宋体"/>
+          <w:kern w:val="0"/>
+          <w:sz w:val="24"/>
+          <w:szCs w:val="24"/>
+          <w:lang w:val="en-US" w:eastAsia="zh-CN" w:bidi="ar"/>
+        </w:rPr>
+        <w:t>[+2, +3]</w:t>
+      </w:r>
+    </w:p>
+    <w:p>
+      <w:pPr>
+        <w:keepNext w:val="0"/>
+        <w:keepLines w:val="0"/>
+        <w:widowControl/>
+        <w:suppressLineNumbers w:val="0"/>
+        <w:jc w:val="left"/>
+      </w:pPr>
+      <w:r>
+        <w:rPr>
+          <w:rFonts w:ascii="宋体" w:hAnsi="宋体" w:eastAsia="宋体" w:cs="宋体"/>
+          <w:kern w:val="0"/>
+          <w:sz w:val="24"/>
+          <w:szCs w:val="24"/>
+          <w:lang w:val="en-US" w:eastAsia="zh-CN" w:bidi="ar"/>
+        </w:rPr>
+        <w:t>[+3, +4]</w:t>
+      </w:r>
+    </w:p>
+    <w:p>
+      <w:pPr>
+        <w:keepNext w:val="0"/>
+        <w:keepLines w:val="0"/>
+        <w:widowControl/>
+        <w:suppressLineNumbers w:val="0"/>
+        <w:jc w:val="left"/>
+      </w:pPr>
+      <w:r>
+        <w:rPr>
+          <w:rFonts w:ascii="宋体" w:hAnsi="宋体" w:eastAsia="宋体" w:cs="宋体"/>
+          <w:kern w:val="0"/>
+          <w:sz w:val="24"/>
+          <w:szCs w:val="24"/>
+          <w:lang w:val="en-US" w:eastAsia="zh-CN" w:bidi="ar"/>
+        </w:rPr>
+        <w:t>[S, A, B]</w:t>
+      </w:r>
+    </w:p>
+    <w:p>
+      <w:pPr>
+        <w:keepNext w:val="0"/>
+        <w:keepLines w:val="0"/>
+        <w:widowControl/>
+        <w:suppressLineNumbers w:val="0"/>
+        <w:jc w:val="left"/>
+      </w:pPr>
+      <w:r>
+        <w:rPr>
+          <w:rStyle w:val="7"/>
+          <w:rFonts w:ascii="宋体" w:hAnsi="宋体" w:eastAsia="宋体" w:cs="宋体"/>
+          <w:kern w:val="0"/>
+          <w:sz w:val="24"/>
+          <w:szCs w:val="24"/>
+          <w:lang w:val="en-US" w:eastAsia="zh-CN" w:bidi="ar"/>
+        </w:rPr>
+        <w:t>冷门潜质</w:t>
+      </w:r>
+      <w:r>
+        <w:rPr>
+          <w:rFonts w:ascii="宋体" w:hAnsi="宋体" w:eastAsia="宋体" w:cs="宋体"/>
+          <w:kern w:val="0"/>
+          <w:sz w:val="24"/>
+          <w:szCs w:val="24"/>
+          <w:lang w:val="en-US" w:eastAsia="zh-CN" w:bidi="ar"/>
+        </w:rPr>
+        <w:t>​</w:t>
+      </w:r>
+    </w:p>
+    <w:p>
+      <w:pPr>
+        <w:keepNext w:val="0"/>
+        <w:keepLines w:val="0"/>
+        <w:widowControl/>
+        <w:suppressLineNumbers w:val="0"/>
+        <w:jc w:val="left"/>
+      </w:pPr>
+      <w:r>
+        <w:rPr>
+          <w:rFonts w:ascii="宋体" w:hAnsi="宋体" w:eastAsia="宋体" w:cs="宋体"/>
+          <w:kern w:val="0"/>
+          <w:sz w:val="24"/>
+          <w:szCs w:val="24"/>
+          <w:lang w:val="en-US" w:eastAsia="zh-CN" w:bidi="ar"/>
+        </w:rPr>
+        <w:t>[-1, 0]</w:t>
+      </w:r>
+    </w:p>
+    <w:p>
+      <w:pPr>
+        <w:keepNext w:val="0"/>
+        <w:keepLines w:val="0"/>
+        <w:widowControl/>
+        <w:suppressLineNumbers w:val="0"/>
+        <w:jc w:val="left"/>
+      </w:pPr>
+      <w:r>
+        <w:rPr>
+          <w:rFonts w:ascii="宋体" w:hAnsi="宋体" w:eastAsia="宋体" w:cs="宋体"/>
+          <w:kern w:val="0"/>
+          <w:sz w:val="24"/>
+          <w:szCs w:val="24"/>
+          <w:lang w:val="en-US" w:eastAsia="zh-CN" w:bidi="ar"/>
+        </w:rPr>
+        <w:t>[-3, -4]</w:t>
+      </w:r>
+    </w:p>
+    <w:p>
+      <w:pPr>
+        <w:keepNext w:val="0"/>
+        <w:keepLines w:val="0"/>
+        <w:widowControl/>
+        <w:suppressLineNumbers w:val="0"/>
+        <w:jc w:val="left"/>
+      </w:pPr>
+      <w:r>
+        <w:rPr>
+          <w:rFonts w:ascii="宋体" w:hAnsi="宋体" w:eastAsia="宋体" w:cs="宋体"/>
+          <w:kern w:val="0"/>
+          <w:sz w:val="24"/>
+          <w:szCs w:val="24"/>
+          <w:lang w:val="en-US" w:eastAsia="zh-CN" w:bidi="ar"/>
+        </w:rPr>
+        <w:t>[D, E]</w:t>
+      </w:r>
+    </w:p>
+    <w:p>
+      <w:pPr>
+        <w:keepNext w:val="0"/>
+        <w:keepLines w:val="0"/>
+        <w:widowControl/>
+        <w:suppressLineNumbers w:val="0"/>
+        <w:jc w:val="left"/>
+      </w:pPr>
+      <w:r>
+        <w:rPr>
+          <w:rStyle w:val="7"/>
+          <w:rFonts w:ascii="宋体" w:hAnsi="宋体" w:eastAsia="宋体" w:cs="宋体"/>
+          <w:kern w:val="0"/>
+          <w:sz w:val="24"/>
+          <w:szCs w:val="24"/>
+          <w:lang w:val="en-US" w:eastAsia="zh-CN" w:bidi="ar"/>
+        </w:rPr>
+        <w:t>均衡博弈</w:t>
+      </w:r>
+      <w:r>
+        <w:rPr>
+          <w:rFonts w:ascii="宋体" w:hAnsi="宋体" w:eastAsia="宋体" w:cs="宋体"/>
+          <w:kern w:val="0"/>
+          <w:sz w:val="24"/>
+          <w:szCs w:val="24"/>
+          <w:lang w:val="en-US" w:eastAsia="zh-CN" w:bidi="ar"/>
+        </w:rPr>
+        <w:t>​</w:t>
+      </w:r>
+    </w:p>
+    <w:p>
+      <w:pPr>
+        <w:keepNext w:val="0"/>
+        <w:keepLines w:val="0"/>
+        <w:widowControl/>
+        <w:suppressLineNumbers w:val="0"/>
+        <w:jc w:val="left"/>
+      </w:pPr>
+      <w:r>
+        <w:rPr>
+          <w:rFonts w:ascii="宋体" w:hAnsi="宋体" w:eastAsia="宋体" w:cs="宋体"/>
+          <w:kern w:val="0"/>
+          <w:sz w:val="24"/>
+          <w:szCs w:val="24"/>
+          <w:lang w:val="en-US" w:eastAsia="zh-CN" w:bidi="ar"/>
+        </w:rPr>
+        <w:t>[0]</w:t>
+      </w:r>
+    </w:p>
+    <w:p>
+      <w:pPr>
+        <w:keepNext w:val="0"/>
+        <w:keepLines w:val="0"/>
+        <w:widowControl/>
+        <w:suppressLineNumbers w:val="0"/>
+        <w:jc w:val="left"/>
+      </w:pPr>
+      <w:r>
+        <w:rPr>
+          <w:rFonts w:ascii="宋体" w:hAnsi="宋体" w:eastAsia="宋体" w:cs="宋体"/>
+          <w:kern w:val="0"/>
+          <w:sz w:val="24"/>
+          <w:szCs w:val="24"/>
+          <w:lang w:val="en-US" w:eastAsia="zh-CN" w:bidi="ar"/>
+        </w:rPr>
+        <w:t>[0]</w:t>
+      </w:r>
+    </w:p>
+    <w:p>
+      <w:pPr>
+        <w:keepNext w:val="0"/>
+        <w:keepLines w:val="0"/>
+        <w:widowControl/>
+        <w:suppressLineNumbers w:val="0"/>
+        <w:jc w:val="left"/>
+      </w:pPr>
+      <w:r>
+        <w:rPr>
+          <w:rFonts w:ascii="宋体" w:hAnsi="宋体" w:eastAsia="宋体" w:cs="宋体"/>
+          <w:kern w:val="0"/>
+          <w:sz w:val="24"/>
+          <w:szCs w:val="24"/>
+          <w:lang w:val="en-US" w:eastAsia="zh-CN" w:bidi="ar"/>
+        </w:rPr>
+        <w:t>[B, C]</w:t>
+      </w:r>
+    </w:p>
+    <w:p>
+      <w:pPr>
+        <w:rPr>
+          <w:rFonts w:hint="eastAsia"/>
+        </w:rPr>
+      </w:pPr>
+    </w:p>
+    <w:p>
+      <w:pPr>
+        <w:rPr>
+          <w:rFonts w:hint="eastAsia"/>
+        </w:rPr>
+      </w:pPr>
+    </w:p>
+    <w:p>
+      <w:pPr>
+        <w:rPr>
+          <w:rFonts w:hint="eastAsia"/>
+        </w:rPr>
+      </w:pPr>
+    </w:p>
+    <w:p>
+      <w:pPr>
+        <w:rPr>
+          <w:rFonts w:hint="eastAsia"/>
+          <w:lang w:val="en-US" w:eastAsia="zh-CN"/>
+        </w:rPr>
+      </w:pPr>
+      <w:r>
+        <w:rPr>
+          <w:rFonts w:hint="eastAsia"/>
+          <w:lang w:val="en-US" w:eastAsia="zh-CN"/>
+        </w:rPr>
+        <w:t>明确策略筛选卡片功能和操作逻辑：</w:t>
+      </w:r>
+    </w:p>
+    <w:p>
+      <w:pPr>
+        <w:rPr>
+          <w:rFonts w:hint="eastAsia"/>
+          <w:lang w:val="en-US" w:eastAsia="zh-CN"/>
+        </w:rPr>
+      </w:pPr>
+    </w:p>
+    <w:p>
+      <w:pPr>
+        <w:rPr>
+          <w:rFonts w:hint="eastAsia"/>
+          <w:lang w:val="en-US" w:eastAsia="zh-CN"/>
+        </w:rPr>
+      </w:pPr>
+      <w:r>
+        <w:rPr>
+          <w:rFonts w:hint="eastAsia"/>
+          <w:lang w:val="en-US" w:eastAsia="zh-CN"/>
+        </w:rPr>
+        <w:t>策略筛选卡片区域是用户选择策略作用于筛选统计和筛选结果的区域；</w:t>
+      </w:r>
+    </w:p>
+    <w:p>
+      <w:pPr>
+        <w:rPr>
+          <w:rFonts w:hint="eastAsia"/>
+          <w:lang w:val="en-US" w:eastAsia="zh-CN"/>
+        </w:rPr>
+      </w:pPr>
+      <w:r>
+        <w:rPr>
+          <w:rFonts w:hint="eastAsia"/>
+          <w:lang w:val="en-US" w:eastAsia="zh-CN"/>
+        </w:rPr>
+        <w:t>策略赛选区域使用某种策略有两种选择方式，一种是下拉框选择，一种是策略列表的卡片点击选择；</w:t>
+      </w:r>
+    </w:p>
+    <w:p>
+      <w:pPr>
+        <w:rPr>
+          <w:rFonts w:hint="eastAsia"/>
+          <w:lang w:val="en-US" w:eastAsia="zh-CN"/>
+        </w:rPr>
+      </w:pPr>
+      <w:r>
+        <w:rPr>
+          <w:rFonts w:hint="eastAsia"/>
+          <w:lang w:val="en-US" w:eastAsia="zh-CN"/>
+        </w:rPr>
+        <w:t>当无论哪种方式选择策略后，策略详情都会展示出来，当没有策略在选择状态下，策略详情处于隐藏状态；</w:t>
+      </w:r>
+    </w:p>
+    <w:p>
+      <w:pPr>
+        <w:rPr>
+          <w:rFonts w:hint="eastAsia"/>
+          <w:lang w:val="en-US" w:eastAsia="zh-CN"/>
+        </w:rPr>
+      </w:pPr>
+      <w:r>
+        <w:rPr>
+          <w:rFonts w:hint="eastAsia"/>
+          <w:lang w:val="en-US" w:eastAsia="zh-CN"/>
+        </w:rPr>
+        <w:t>策略筛选下拉框默认状态是在“请选择策略”的提醒状态，表明没在下来框选择策略；</w:t>
+      </w:r>
+    </w:p>
+    <w:p>
+      <w:pPr>
+        <w:rPr>
+          <w:rFonts w:hint="eastAsia"/>
+          <w:lang w:val="en-US" w:eastAsia="zh-CN"/>
+        </w:rPr>
+      </w:pPr>
+      <w:r>
+        <w:rPr>
+          <w:rFonts w:hint="eastAsia"/>
+          <w:lang w:val="en-US" w:eastAsia="zh-CN"/>
+        </w:rPr>
+        <w:t>策略列表的卡片本质是策略筛选下拉框的一种快捷选择，当有“当前策略”时，当前策略显示在第一个；</w:t>
+      </w:r>
+    </w:p>
+    <w:p>
+      <w:pPr>
+        <w:rPr>
+          <w:rFonts w:hint="eastAsia"/>
+          <w:lang w:val="en-US" w:eastAsia="zh-CN"/>
+        </w:rPr>
+      </w:pPr>
+      <w:r>
+        <w:rPr>
+          <w:rFonts w:hint="eastAsia"/>
+          <w:lang w:val="en-US" w:eastAsia="zh-CN"/>
+        </w:rPr>
+        <w:t>当在策略列表选择一个策略时，策略下拉框也会选中此策略，同样，当在策略筛选下拉框选中某策略时，策略列表中的策略卡片也被选中；</w:t>
+      </w:r>
+    </w:p>
+    <w:p>
+      <w:pPr>
+        <w:rPr>
+          <w:rFonts w:hint="eastAsia"/>
+          <w:lang w:val="en-US" w:eastAsia="zh-CN"/>
+        </w:rPr>
+      </w:pPr>
+      <w:r>
+        <w:rPr>
+          <w:rFonts w:hint="eastAsia"/>
+          <w:lang w:val="en-US" w:eastAsia="zh-CN"/>
+        </w:rPr>
+        <w:t>为“当前策略”加一个小图标如NEW，却别于其它策略卡片；</w:t>
+      </w:r>
+    </w:p>
+    <w:p>
+      <w:pPr>
+        <w:rPr>
+          <w:rFonts w:hint="default"/>
+          <w:lang w:val="en-US" w:eastAsia="zh-CN"/>
+        </w:rPr>
+      </w:pPr>
+      <w:r>
+        <w:rPr>
+          <w:rFonts w:hint="eastAsia"/>
+          <w:lang w:val="en-US" w:eastAsia="zh-CN"/>
+        </w:rPr>
+        <w:t>当切换策略选择下拉框或者策略列表的卡片时，策略统计和策略结果随着策略变化而变化；</w:t>
+      </w:r>
+    </w:p>
+    <w:p>
+      <w:pPr>
+        <w:rPr>
+          <w:rFonts w:hint="default"/>
+          <w:lang w:val="en-US" w:eastAsia="zh-CN"/>
+        </w:rPr>
+      </w:pPr>
+    </w:p>
+    <w:p>
+      <w:pPr>
+        <w:rPr>
+          <w:rFonts w:hint="eastAsia" w:eastAsiaTheme="minorEastAsia"/>
+          <w:lang w:val="en-US" w:eastAsia="zh-CN"/>
+        </w:rPr>
+      </w:pPr>
+    </w:p>
+    <w:p>
+      <w:pPr>
+        <w:rPr>
+          <w:rFonts w:hint="eastAsia"/>
+        </w:rPr>
+      </w:pPr>
+    </w:p>
+    <w:p>
+      <w:pPr>
+        <w:rPr>
+          <w:rFonts w:hint="eastAsia"/>
+        </w:rPr>
+      </w:pPr>
+    </w:p>
+    <w:p>
+      <w:pPr>
+        <w:rPr>
+          <w:rFonts w:hint="eastAsia"/>
+        </w:rPr>
+      </w:pPr>
+    </w:p>
+    <w:p>
+      <w:pPr>
+        <w:rPr>
+          <w:rFonts w:hint="eastAsia"/>
+        </w:rPr>
+      </w:pPr>
+      <w:r>
+        <w:rPr>
+          <w:rFonts w:hint="eastAsia"/>
+        </w:rPr>
+        <w:t>“其它条件”</w:t>
+      </w:r>
+      <w:r>
+        <w:rPr>
+          <w:rFonts w:hint="eastAsia"/>
+          <w:lang w:val="en-US" w:eastAsia="zh-CN"/>
+        </w:rPr>
+        <w:t>卡片</w:t>
+      </w:r>
+      <w:r>
+        <w:rPr>
+          <w:rFonts w:hint="eastAsia"/>
+        </w:rPr>
+        <w:t>，需验证功能范围（联赛、date_time、date_range）与概念一致</w:t>
+      </w:r>
+      <w:r>
+        <w:rPr>
+          <w:rFonts w:hint="eastAsia"/>
+        </w:rPr>
+        <w:tab/>
+      </w:r>
+      <w:r>
+        <w:rPr>
+          <w:rFonts w:hint="eastAsia"/>
+        </w:rPr>
+        <w:t>不能混入策略维度条件</w:t>
+      </w:r>
+    </w:p>
+    <w:p>
+      <w:pPr>
+        <w:rPr>
+          <w:rFonts w:hint="eastAsia"/>
+        </w:rPr>
+      </w:pPr>
+      <w:r>
+        <w:rPr>
+          <w:rFonts w:hint="eastAsia"/>
+        </w:rPr>
+        <w:t>排序方式实现</w:t>
+      </w:r>
+      <w:r>
+        <w:rPr>
+          <w:rFonts w:hint="eastAsia"/>
+        </w:rPr>
+        <w:tab/>
+      </w:r>
+      <w:r>
+        <w:rPr>
+          <w:rFonts w:hint="eastAsia"/>
+        </w:rPr>
+        <w:t>目前可能和策略筛选混在一起，需独立成卡片，仅控制列表顺序</w:t>
+      </w:r>
+      <w:r>
+        <w:rPr>
+          <w:rFonts w:hint="eastAsia"/>
+        </w:rPr>
+        <w:tab/>
+      </w:r>
+      <w:r>
+        <w:rPr>
+          <w:rFonts w:hint="eastAsia"/>
+        </w:rPr>
+        <w:t>不参与筛选逻辑</w:t>
+      </w:r>
+    </w:p>
+    <w:p>
+      <w:pPr>
+        <w:rPr>
+          <w:rFonts w:hint="eastAsia"/>
+        </w:rPr>
+      </w:pPr>
+    </w:p>
+    <w:p>
+      <w:pPr>
+        <w:rPr>
+          <w:rFonts w:hint="eastAsia"/>
+        </w:rPr>
+      </w:pPr>
+    </w:p>
+    <w:p>
+      <w:pPr>
+        <w:rPr>
+          <w:rFonts w:hint="eastAsia"/>
+        </w:rPr>
+      </w:pPr>
+    </w:p>
+    <w:p>
+      <w:pPr>
+        <w:rPr>
+          <w:rFonts w:hint="eastAsia"/>
+        </w:rPr>
+      </w:pPr>
+    </w:p>
+    <w:p>
+      <w:pPr>
+        <w:rPr>
+          <w:rFonts w:hint="eastAsia"/>
+        </w:rPr>
+      </w:pPr>
+    </w:p>
+    <w:p>
+      <w:pPr>
+        <w:rPr>
+          <w:rFonts w:hint="eastAsia"/>
+        </w:rPr>
+      </w:pPr>
+    </w:p>
+    <w:p>
+      <w:pPr>
+        <w:rPr>
+          <w:rFonts w:hint="eastAsia"/>
+        </w:rPr>
+      </w:pPr>
+    </w:p>
+    <w:p>
+      <w:pPr>
+        <w:rPr>
+          <w:rFonts w:hint="eastAsia"/>
+        </w:rPr>
+      </w:pPr>
+      <w:r>
+        <w:rPr>
+          <w:rFonts w:hint="eastAsia"/>
+        </w:rPr>
+        <w:t>调整后端API测试</w:t>
+      </w:r>
+    </w:p>
+    <w:p>
+      <w:pPr>
+        <w:rPr>
+          <w:rFonts w:hint="eastAsia"/>
+        </w:rPr>
+      </w:pPr>
+    </w:p>
+    <w:p>
+      <w:pPr>
+        <w:rPr>
+          <w:rFonts w:hint="eastAsia"/>
+        </w:rPr>
+      </w:pPr>
+      <w:r>
+        <w:rPr>
+          <w:rFonts w:hint="eastAsia"/>
+        </w:rPr>
+        <w:t>核对失败测试的请求参数与API实际模式（backend/schemas/），修正测试数据或调整模式验证规则。</w:t>
+      </w:r>
+    </w:p>
+    <w:p>
+      <w:pPr>
+        <w:rPr>
+          <w:rFonts w:hint="eastAsia"/>
+        </w:rPr>
+      </w:pPr>
+      <w:r>
+        <w:rPr>
+          <w:rFonts w:hint="eastAsia"/>
+        </w:rPr>
+        <w:t>针对安全测试，补充更严格的输入净化逻辑，确保SQL/XSS攻击payload被正确处理。</w:t>
+      </w:r>
+    </w:p>
+    <w:p>
+      <w:pPr>
+        <w:rPr>
+          <w:rFonts w:hint="eastAsia"/>
+        </w:rPr>
+      </w:pPr>
+      <w:r>
+        <w:rPr>
+          <w:rFonts w:hint="eastAsia"/>
+        </w:rPr>
+        <w:t>补全性能测试数据</w:t>
+      </w:r>
+    </w:p>
+    <w:p>
+      <w:pPr>
+        <w:rPr>
+          <w:rFonts w:hint="eastAsia"/>
+        </w:rPr>
+      </w:pPr>
+    </w:p>
+    <w:p>
+      <w:pPr>
+        <w:rPr>
+          <w:rFonts w:hint="eastAsia"/>
+        </w:rPr>
+      </w:pPr>
+      <w:r>
+        <w:rPr>
+          <w:rFonts w:hint="eastAsia"/>
+        </w:rPr>
+        <w:t>为导出接口准备模拟大数据集，确保内存使用测试有实际数据支撑。</w:t>
+      </w:r>
+    </w:p>
+    <w:p>
+      <w:pPr>
+        <w:rPr>
+          <w:rFonts w:hint="eastAsia"/>
+        </w:rPr>
+      </w:pPr>
+      <w:r>
+        <w:rPr>
+          <w:rFonts w:hint="eastAsia"/>
+        </w:rPr>
+        <w:t>调整并发测试的断言，允许在合理范围内波动。</w:t>
+      </w:r>
+    </w:p>
+    <w:p>
+      <w:pPr>
+        <w:rPr>
+          <w:rFonts w:hint="eastAsia"/>
+        </w:rPr>
+      </w:pPr>
+    </w:p>
+    <w:p>
+      <w:pPr>
+        <w:rPr>
+          <w:rFonts w:hint="eastAsia"/>
+        </w:rPr>
+      </w:pPr>
+    </w:p>
+    <w:p>
+      <w:pPr>
+        <w:rPr>
+          <w:rFonts w:hint="eastAsia"/>
+        </w:rPr>
+      </w:pPr>
+    </w:p>
+    <w:p>
+      <w:pPr>
+        <w:rPr>
+          <w:rFonts w:hint="eastAsia"/>
+          <w:lang w:val="en-US" w:eastAsia="zh-CN"/>
+        </w:rPr>
+      </w:pPr>
+      <w:r>
+        <w:rPr>
+          <w:rFonts w:hint="eastAsia"/>
+          <w:lang w:val="en-US" w:eastAsia="zh-CN"/>
+        </w:rPr>
+        <w:t>对齐以下功能改进：</w:t>
+      </w:r>
+    </w:p>
+    <w:p>
+      <w:pPr>
+        <w:rPr>
+          <w:rFonts w:hint="eastAsia"/>
+          <w:lang w:val="en-US" w:eastAsia="zh-CN"/>
+        </w:rPr>
+      </w:pPr>
+    </w:p>
+    <w:p>
+      <w:pPr>
+        <w:numPr>
+          <w:ilvl w:val="0"/>
+          <w:numId w:val="1"/>
+        </w:numPr>
+        <w:rPr>
+          <w:rFonts w:hint="eastAsia"/>
+          <w:lang w:val="en-US" w:eastAsia="zh-CN"/>
+        </w:rPr>
+      </w:pPr>
+      <w:r>
+        <w:rPr>
+          <w:rFonts w:hint="eastAsia"/>
+          <w:lang w:val="en-US" w:eastAsia="zh-CN"/>
+        </w:rPr>
+        <w:t>当刷新页面或者重新打开页面，默认加载最新期的比赛场次，其它条件的date_time的值也相对应更新显示到最新值，</w:t>
+      </w:r>
+    </w:p>
+    <w:p>
+      <w:pPr>
+        <w:numPr>
+          <w:ilvl w:val="0"/>
+          <w:numId w:val="1"/>
+        </w:numPr>
+        <w:rPr>
+          <w:rFonts w:hint="default"/>
+          <w:lang w:val="en-US" w:eastAsia="zh-CN"/>
+        </w:rPr>
+      </w:pPr>
+      <w:r>
+        <w:rPr>
+          <w:rFonts w:hint="eastAsia"/>
+          <w:lang w:val="en-US" w:eastAsia="zh-CN"/>
+        </w:rPr>
+        <w:t>当点击“获取实时数据”，这个动作是向数据库请求，查询有没有更新，并页面上更新对应参数值；</w:t>
+      </w:r>
+    </w:p>
+    <w:p>
+      <w:pPr>
+        <w:numPr>
+          <w:numId w:val="0"/>
+        </w:numPr>
+        <w:rPr>
+          <w:rFonts w:hint="eastAsia"/>
+          <w:lang w:val="en-US" w:eastAsia="zh-CN"/>
+        </w:rPr>
+      </w:pPr>
+    </w:p>
+    <w:p>
+      <w:pPr>
+        <w:numPr>
+          <w:numId w:val="0"/>
+        </w:numPr>
+        <w:rPr>
+          <w:rFonts w:hint="eastAsia"/>
+          <w:lang w:val="en-US" w:eastAsia="zh-CN"/>
+        </w:rPr>
+      </w:pPr>
+    </w:p>
+    <w:p>
+      <w:pPr>
+        <w:numPr>
+          <w:ilvl w:val="0"/>
+          <w:numId w:val="2"/>
+        </w:numPr>
+        <w:rPr>
+          <w:rFonts w:hint="eastAsia"/>
+          <w:lang w:val="en-US" w:eastAsia="zh-CN"/>
+        </w:rPr>
+      </w:pPr>
+      <w:r>
+        <w:rPr>
+          <w:rFonts w:hint="eastAsia"/>
+          <w:lang w:val="en-US" w:eastAsia="zh-CN"/>
+        </w:rPr>
+        <w:t>保存策略后，现在并没有同步到策略筛选卡片中，应该是策略一保存，策略筛选栏中会相应的增加此策略；</w:t>
+      </w:r>
+    </w:p>
+    <w:p>
+      <w:pPr>
+        <w:numPr>
+          <w:ilvl w:val="0"/>
+          <w:numId w:val="2"/>
+        </w:numPr>
+        <w:rPr>
+          <w:rFonts w:hint="default"/>
+          <w:lang w:val="en-US" w:eastAsia="zh-CN"/>
+        </w:rPr>
+      </w:pPr>
+      <w:r>
+        <w:rPr>
+          <w:rFonts w:hint="eastAsia"/>
+          <w:lang w:val="en-US" w:eastAsia="zh-CN"/>
+        </w:rPr>
+        <w:t>“策略管理”按钮目前这个功能还不完善，点击并没有出来管理界面；查找原因并修复；</w:t>
+      </w:r>
     </w:p>
     <w:sectPr>
       <w:pgSz w:w="11906" w:h="16838"/>
@@ -5208,6 +6949,41 @@
     </w:sectPr>
   </w:body>
 </w:document>
+</file>
+
+<file path=word/numbering.xml><?xml version="1.0" encoding="utf-8"?>
+<w:numbering xmlns:wpc="http://schemas.microsoft.com/office/word/2010/wordprocessingCanvas" xmlns:mc="http://schemas.openxmlformats.org/markup-compatibility/2006" xmlns:o="urn:schemas-microsoft-com:office:office" xmlns:r="http://schemas.openxmlformats.org/officeDocument/2006/relationships" xmlns:m="http://schemas.openxmlformats.org/officeDocument/2006/math" xmlns:v="urn:schemas-microsoft-com:vml" xmlns:wp14="http://schemas.microsoft.com/office/word/2010/wordprocessingDrawing" xmlns:wp="http://schemas.openxmlformats.org/drawingml/2006/wordprocessingDrawing" xmlns:w10="urn:schemas-microsoft-com:office:word" xmlns:w="http://schemas.openxmlformats.org/wordprocessingml/2006/main" xmlns:w14="http://schemas.microsoft.com/office/word/2010/wordml" xmlns:wpg="http://schemas.microsoft.com/office/word/2010/wordprocessingGroup" xmlns:wpi="http://schemas.microsoft.com/office/word/2010/wordprocessingInk" xmlns:wne="http://schemas.microsoft.com/office/word/2006/wordml" xmlns:wps="http://schemas.microsoft.com/office/word/2010/wordprocessingShape" xmlns:wpsCustomData="http://www.wps.cn/officeDocument/2013/wpsCustomData" mc:Ignorable="w14 wp14">
+  <w:abstractNum w:abstractNumId="0">
+    <w:nsid w:val="BDB92750"/>
+    <w:multiLevelType w:val="singleLevel"/>
+    <w:tmpl w:val="BDB92750"/>
+    <w:lvl w:ilvl="0" w:tentative="0">
+      <w:start w:val="1"/>
+      <w:numFmt w:val="decimal"/>
+      <w:suff w:val="nothing"/>
+      <w:lvlText w:val="%1、"/>
+      <w:lvlJc w:val="left"/>
+    </w:lvl>
+  </w:abstractNum>
+  <w:abstractNum w:abstractNumId="1">
+    <w:nsid w:val="ED3CCE9B"/>
+    <w:multiLevelType w:val="singleLevel"/>
+    <w:tmpl w:val="ED3CCE9B"/>
+    <w:lvl w:ilvl="0" w:tentative="0">
+      <w:start w:val="1"/>
+      <w:numFmt w:val="decimal"/>
+      <w:suff w:val="nothing"/>
+      <w:lvlText w:val="%1、"/>
+      <w:lvlJc w:val="left"/>
+    </w:lvl>
+  </w:abstractNum>
+  <w:num w:numId="1">
+    <w:abstractNumId w:val="0"/>
+  </w:num>
+  <w:num w:numId="2">
+    <w:abstractNumId w:val="1"/>
+  </w:num>
+</w:numbering>
 </file>
 
 <file path=word/styles.xml><?xml version="1.0" encoding="utf-8"?>
@@ -5313,11 +7089,11 @@
     <w:lsdException w:unhideWhenUsed="0" w:uiPriority="0" w:semiHidden="0" w:name="Document Map"/>
     <w:lsdException w:unhideWhenUsed="0" w:uiPriority="0" w:semiHidden="0" w:name="Plain Text"/>
     <w:lsdException w:unhideWhenUsed="0" w:uiPriority="0" w:semiHidden="0" w:name="E-mail Signature"/>
-    <w:lsdException w:unhideWhenUsed="0" w:uiPriority="0" w:semiHidden="0" w:name="Normal (Web)"/>
+    <w:lsdException w:qFormat="1" w:unhideWhenUsed="0" w:uiPriority="0" w:semiHidden="0" w:name="Normal (Web)"/>
     <w:lsdException w:unhideWhenUsed="0" w:uiPriority="0" w:semiHidden="0" w:name="HTML Acronym"/>
     <w:lsdException w:unhideWhenUsed="0" w:uiPriority="0" w:semiHidden="0" w:name="HTML Address"/>
     <w:lsdException w:unhideWhenUsed="0" w:uiPriority="0" w:semiHidden="0" w:name="HTML Cite"/>
-    <w:lsdException w:unhideWhenUsed="0" w:uiPriority="0" w:semiHidden="0" w:name="HTML Code"/>
+    <w:lsdException w:qFormat="1" w:unhideWhenUsed="0" w:uiPriority="0" w:semiHidden="0" w:name="HTML Code"/>
     <w:lsdException w:unhideWhenUsed="0" w:uiPriority="0" w:semiHidden="0" w:name="HTML Definition"/>
     <w:lsdException w:unhideWhenUsed="0" w:uiPriority="0" w:semiHidden="0" w:name="HTML Keyboard"/>
     <w:lsdException w:unhideWhenUsed="0" w:uiPriority="0" w:semiHidden="0" w:name="HTML Preformatted"/>
@@ -5553,6 +7329,7 @@
   <w:style w:type="paragraph" w:styleId="4">
     <w:name w:val="Normal (Web)"/>
     <w:basedOn w:val="1"/>
+    <w:qFormat/>
     <w:uiPriority w:val="0"/>
     <w:pPr>
       <w:spacing w:before="0" w:beforeAutospacing="1" w:after="0" w:afterAutospacing="1"/>
@@ -5577,6 +7354,7 @@
   <w:style w:type="character" w:styleId="8">
     <w:name w:val="HTML Code"/>
     <w:basedOn w:val="6"/>
+    <w:qFormat/>
     <w:uiPriority w:val="0"/>
     <w:rPr>
       <w:rFonts w:ascii="Courier New" w:hAnsi="Courier New"/>

</xml_diff>